<commit_message>
docs: English versions of planning docs 04 and 05
Co-Authored-By: Claude Opus 5.5 <noreply@anthropic.com>
</commit_message>
<xml_diff>
--- a/docs/planning/04_Unistyles_Deep_Research_Brainstorming.docx
+++ b/docs/planning/04_Unistyles_Deep_Research_Brainstorming.docx
@@ -24,7 +24,7 @@
           <w:szCs w:val="20"/>
           <w:rFonts w:ascii="Calibri" w:cs="Calibri" w:eastAsia="Calibri" w:hAnsi="Calibri"/>
         </w:rPr>
-        <w:t xml:space="preserve">DOCUMENTO 4 DE 5</w:t>
+        <w:t>DOCUMENT 4 OF 5</w:t>
       </w:r>
     </w:p>
     <w:p>
@@ -42,7 +42,7 @@
           <w:rFonts w:ascii="Calibri" w:cs="Calibri" w:eastAsia="Calibri" w:hAnsi="Calibri"/>
           <w:spacing w:val="60"/>
         </w:rPr>
-        <w:t xml:space="preserve">UNISTYLES CURAÇAO · DEEP RESEARCH</w:t>
+        <w:t>UNISTYLES CURAÇAO · DEEP RESEARCH</w:t>
       </w:r>
     </w:p>
     <w:p>
@@ -59,7 +59,7 @@
           <w:szCs w:val="52"/>
           <w:rFonts w:ascii="Georgia" w:cs="Georgia" w:eastAsia="Georgia" w:hAnsi="Georgia"/>
         </w:rPr>
-        <w:t xml:space="preserve">Deep Research &amp; Brainstorming</w:t>
+        <w:t>Deep Research &amp; Brainstorming</w:t>
       </w:r>
     </w:p>
     <w:p>
@@ -88,7 +88,7 @@
           <w:szCs w:val="24"/>
           <w:rFonts w:ascii="Calibri" w:cs="Calibri" w:eastAsia="Calibri" w:hAnsi="Calibri"/>
         </w:rPr>
-        <w:t xml:space="preserve">Contexto de mercado + preguntas de investigación para tu equipo</w:t>
+        <w:t>Market context + research questions for your team</w:t>
       </w:r>
     </w:p>
     <w:p>
@@ -105,7 +105,7 @@
           <w:szCs w:val="19"/>
           <w:rFonts w:ascii="Calibri" w:cs="Calibri" w:eastAsia="Calibri" w:hAnsi="Calibri"/>
         </w:rPr>
-        <w:t xml:space="preserve">Preparado para:  </w:t>
+        <w:t>Prepared for:  Team session: UX/UI · Front-end · Back-end · Marketing · Design</w:t>
       </w:r>
       <w:r>
         <w:rPr>
@@ -114,7 +114,6 @@
           <w:szCs w:val="19"/>
           <w:rFonts w:ascii="Calibri" w:cs="Calibri" w:eastAsia="Calibri" w:hAnsi="Calibri"/>
         </w:rPr>
-        <w:t xml:space="preserve">Sesión con equipo: UX/UI · Front-end · Back-end · Marketing · Diseño</w:t>
       </w:r>
     </w:p>
     <w:p>
@@ -131,7 +130,7 @@
           <w:szCs w:val="19"/>
           <w:rFonts w:ascii="Calibri" w:cs="Calibri" w:eastAsia="Calibri" w:hAnsi="Calibri"/>
         </w:rPr>
-        <w:t xml:space="preserve">Fecha:  </w:t>
+        <w:t>Date:  31 July 2026</w:t>
       </w:r>
       <w:r>
         <w:rPr>
@@ -140,7 +139,6 @@
           <w:szCs w:val="19"/>
           <w:rFonts w:ascii="Calibri" w:cs="Calibri" w:eastAsia="Calibri" w:hAnsi="Calibri"/>
         </w:rPr>
-        <w:t xml:space="preserve">31 de julio de 2026</w:t>
       </w:r>
     </w:p>
     <w:p>
@@ -157,7 +155,7 @@
           <w:szCs w:val="19"/>
           <w:rFonts w:ascii="Calibri" w:cs="Calibri" w:eastAsia="Calibri" w:hAnsi="Calibri"/>
         </w:rPr>
-        <w:t xml:space="preserve">Marco:  </w:t>
+        <w:t>Framework:  Double Diamond — DISCOVER phase</w:t>
       </w:r>
       <w:r>
         <w:rPr>
@@ -166,7 +164,6 @@
           <w:szCs w:val="19"/>
           <w:rFonts w:ascii="Calibri" w:cs="Calibri" w:eastAsia="Calibri" w:hAnsi="Calibri"/>
         </w:rPr>
-        <w:t xml:space="preserve">Double Diamond — fase DESCUBRIR (Discover)</w:t>
       </w:r>
     </w:p>
     <w:p>
@@ -183,7 +180,7 @@
           <w:szCs w:val="19"/>
           <w:rFonts w:ascii="Calibri" w:cs="Calibri" w:eastAsia="Calibri" w:hAnsi="Calibri"/>
         </w:rPr>
-        <w:t xml:space="preserve">Base:  </w:t>
+        <w:t>Basis:  2025 Curaçao data + code audit</w:t>
       </w:r>
       <w:r>
         <w:rPr>
@@ -192,7 +189,6 @@
           <w:szCs w:val="19"/>
           <w:rFonts w:ascii="Calibri" w:cs="Calibri" w:eastAsia="Calibri" w:hAnsi="Calibri"/>
         </w:rPr>
-        <w:t xml:space="preserve">Datos 2025 de Curaçao + auditoría de código</w:t>
       </w:r>
     </w:p>
     <w:p>
@@ -213,7 +209,7 @@
           <w:szCs w:val="28"/>
           <w:rFonts w:ascii="Georgia" w:cs="Georgia" w:eastAsia="Georgia" w:hAnsi="Georgia"/>
         </w:rPr>
-        <w:t xml:space="preserve">Contenido</w:t>
+        <w:t>Contents</w:t>
       </w:r>
     </w:p>
     <w:sdt>
@@ -257,7 +253,7 @@
           <w:szCs w:val="30"/>
           <w:rFonts w:ascii="Georgia" w:cs="Georgia" w:eastAsia="Georgia" w:hAnsi="Georgia"/>
         </w:rPr>
-        <w:t xml:space="preserve">1. Cómo usar este documento</w:t>
+        <w:t>1. How to use this document</w:t>
       </w:r>
     </w:p>
     <w:p>
@@ -273,7 +269,7 @@
           <w:szCs w:val="22"/>
           <w:rFonts w:ascii="Calibri" w:cs="Calibri" w:eastAsia="Calibri" w:hAnsi="Calibri"/>
         </w:rPr>
-        <w:t xml:space="preserve">Este documento tiene dos partes. Primero, un "deep research" del contexto de Curaçao con datos reales, para que todos partan de la misma realidad. Segundo, un banco de preguntas de investigación (pregunta principal + sub-preguntas) organizado por disciplina, más frases "Cómo podríamos" (HMW) para idear soluciones en tu sesión de brainstorming.</w:t>
+        <w:t>This document has two parts. First, a "deep research" of the Curaçao context using real data, so that everyone starts from the same reality. Second, a bank of research questions (main question + sub-questions) organised by discipline, plus "How Might We" (HMW) statements for ideating solutions in your brainstorming session.</w:t>
       </w:r>
     </w:p>
     <w:tbl>
@@ -316,7 +312,7 @@
                 <w:szCs w:val="21"/>
                 <w:rFonts w:ascii="Calibri" w:cs="Calibri" w:eastAsia="Calibri" w:hAnsi="Calibri"/>
               </w:rPr>
-              <w:t xml:space="preserve">Recomendación de uso en la sesión</w:t>
+              <w:t>Recommended use in the session</w:t>
             </w:r>
           </w:p>
           <w:p>
@@ -330,7 +326,7 @@
                 <w:szCs w:val="20"/>
                 <w:rFonts w:ascii="Calibri" w:cs="Calibri" w:eastAsia="Calibri" w:hAnsi="Calibri"/>
               </w:rPr>
-              <w:t xml:space="preserve">1. Lee en voz alta el "deep research" (sección 2) — 10 min.</w:t>
+              <w:t>1. Read the "deep research" (section 2) aloud — 10 min.</w:t>
             </w:r>
           </w:p>
           <w:p>
@@ -344,7 +340,7 @@
                 <w:szCs w:val="20"/>
                 <w:rFonts w:ascii="Calibri" w:cs="Calibri" w:eastAsia="Calibri" w:hAnsi="Calibri"/>
               </w:rPr>
-              <w:t xml:space="preserve">2. Revisen los retos estratégicos (sección 3) y elijan 2–3 para enfocar.</w:t>
+              <w:t>2. Review the strategic challenges (section 3) and choose 2–3 to focus on.</w:t>
             </w:r>
           </w:p>
           <w:p>
@@ -358,7 +354,7 @@
                 <w:szCs w:val="20"/>
                 <w:rFonts w:ascii="Calibri" w:cs="Calibri" w:eastAsia="Calibri" w:hAnsi="Calibri"/>
               </w:rPr>
-              <w:t xml:space="preserve">3. Usen las preguntas por disciplina (sección 4) para repartir investigación.</w:t>
+              <w:t>3. Use the questions by discipline (section 4) to divide up the research.</w:t>
             </w:r>
           </w:p>
           <w:p>
@@ -372,7 +368,7 @@
                 <w:szCs w:val="20"/>
                 <w:rFonts w:ascii="Calibri" w:cs="Calibri" w:eastAsia="Calibri" w:hAnsi="Calibri"/>
               </w:rPr>
-              <w:t xml:space="preserve">4. Con los HMW (sección 5) hagan una lluvia de ideas de soluciones.</w:t>
+              <w:t>4. Use the HMWs (section 5) to brainstorm solutions.</w:t>
             </w:r>
           </w:p>
           <w:p>
@@ -386,7 +382,7 @@
                 <w:szCs w:val="20"/>
                 <w:rFonts w:ascii="Calibri" w:cs="Calibri" w:eastAsia="Calibri" w:hAnsi="Calibri"/>
               </w:rPr>
-              <w:t xml:space="preserve">5. Anoten supuestos e hipótesis a validar (sección 6).</w:t>
+              <w:t>5. Write down the assumptions and hypotheses to validate (section 6).</w:t>
             </w:r>
           </w:p>
         </w:tc>
@@ -414,7 +410,7 @@
           <w:szCs w:val="30"/>
           <w:rFonts w:ascii="Georgia" w:cs="Georgia" w:eastAsia="Georgia" w:hAnsi="Georgia"/>
         </w:rPr>
-        <w:t xml:space="preserve">2. Deep research: el contexto de Curaçao</w:t>
+        <w:t>2. Deep research: the Curaçao context</w:t>
       </w:r>
     </w:p>
     <w:p>
@@ -430,7 +426,7 @@
           <w:szCs w:val="22"/>
           <w:rFonts w:ascii="Calibri" w:cs="Calibri" w:eastAsia="Calibri" w:hAnsi="Calibri"/>
         </w:rPr>
-        <w:t xml:space="preserve">Retrato del mercado con datos de 2025. Cada dato viene con una implicación directa para Unistyles.</w:t>
+        <w:t>A portrait of the market using 2025 data. Each data point comes with a direct implication for Unistyles.</w:t>
       </w:r>
     </w:p>
     <w:p>
@@ -447,7 +443,7 @@
           <w:szCs w:val="25"/>
           <w:rFonts w:ascii="Georgia" w:cs="Georgia" w:eastAsia="Georgia" w:hAnsi="Georgia"/>
         </w:rPr>
-        <w:t xml:space="preserve">2.1 Población y mercado</w:t>
+        <w:t>2.1 Population and market</w:t>
       </w:r>
     </w:p>
     <w:tbl>
@@ -496,7 +492,7 @@
                 <w:szCs w:val="18"/>
                 <w:rFonts w:ascii="Calibri" w:cs="Calibri" w:eastAsia="Calibri" w:hAnsi="Calibri"/>
               </w:rPr>
-              <w:t xml:space="preserve">Dato (2025)</w:t>
+              <w:t>Data point (2025)</w:t>
             </w:r>
           </w:p>
         </w:tc>
@@ -525,7 +521,7 @@
                 <w:szCs w:val="18"/>
                 <w:rFonts w:ascii="Calibri" w:cs="Calibri" w:eastAsia="Calibri" w:hAnsi="Calibri"/>
               </w:rPr>
-              <w:t xml:space="preserve">Cifra</w:t>
+              <w:t>Figure</w:t>
             </w:r>
           </w:p>
         </w:tc>
@@ -554,7 +550,7 @@
                 <w:szCs w:val="18"/>
                 <w:rFonts w:ascii="Calibri" w:cs="Calibri" w:eastAsia="Calibri" w:hAnsi="Calibri"/>
               </w:rPr>
-              <w:t xml:space="preserve">Implicación para Unistyles</w:t>
+              <w:t>Implication for Unistyles</w:t>
             </w:r>
           </w:p>
         </w:tc>
@@ -585,7 +581,7 @@
                 <w:szCs w:val="18"/>
                 <w:rFonts w:ascii="Calibri" w:cs="Calibri" w:eastAsia="Calibri" w:hAnsi="Calibri"/>
               </w:rPr>
-              <w:t xml:space="preserve">Población</w:t>
+              <w:t>Population</w:t>
             </w:r>
           </w:p>
         </w:tc>
@@ -614,7 +610,7 @@
                 <w:szCs w:val="18"/>
                 <w:rFonts w:ascii="Calibri" w:cs="Calibri" w:eastAsia="Calibri" w:hAnsi="Calibri"/>
               </w:rPr>
-              <w:t xml:space="preserve">~185.000 personas</w:t>
+              <w:t>~185,000 people</w:t>
             </w:r>
           </w:p>
         </w:tc>
@@ -643,7 +639,7 @@
                 <w:szCs w:val="18"/>
                 <w:rFonts w:ascii="Calibri" w:cs="Calibri" w:eastAsia="Calibri" w:hAnsi="Calibri"/>
               </w:rPr>
-              <w:t xml:space="preserve">Mercado pequeño: la fidelización y el boca a boca pesan más que el volumen.</w:t>
+              <w:t>Small market: loyalty and word of mouth matter more than volume.</w:t>
             </w:r>
           </w:p>
         </w:tc>
@@ -674,7 +670,7 @@
                 <w:szCs w:val="18"/>
                 <w:rFonts w:ascii="Calibri" w:cs="Calibri" w:eastAsia="Calibri" w:hAnsi="Calibri"/>
               </w:rPr>
-              <w:t xml:space="preserve">Mayores de 65</w:t>
+              <w:t>Aged over 65</w:t>
             </w:r>
           </w:p>
         </w:tc>
@@ -703,7 +699,7 @@
                 <w:szCs w:val="18"/>
                 <w:rFonts w:ascii="Calibri" w:cs="Calibri" w:eastAsia="Calibri" w:hAnsi="Calibri"/>
               </w:rPr>
-              <w:t xml:space="preserve">~16,8%</w:t>
+              <w:t>~16.8%</w:t>
             </w:r>
           </w:p>
         </w:tc>
@@ -732,7 +728,7 @@
                 <w:szCs w:val="18"/>
                 <w:rFonts w:ascii="Calibri" w:cs="Calibri" w:eastAsia="Calibri" w:hAnsi="Calibri"/>
               </w:rPr>
-              <w:t xml:space="preserve">Segmento maduro relevante: interfaz simple, textos legibles.</w:t>
+              <w:t>Significant mature segment: simple interface, legible text.</w:t>
             </w:r>
           </w:p>
         </w:tc>
@@ -763,7 +759,7 @@
                 <w:szCs w:val="18"/>
                 <w:rFonts w:ascii="Calibri" w:cs="Calibri" w:eastAsia="Calibri" w:hAnsi="Calibri"/>
               </w:rPr>
-              <w:t xml:space="preserve">Crecimiento poblacional</w:t>
+              <w:t>Population growth</w:t>
             </w:r>
           </w:p>
         </w:tc>
@@ -792,7 +788,7 @@
                 <w:szCs w:val="18"/>
                 <w:rFonts w:ascii="Calibri" w:cs="Calibri" w:eastAsia="Calibri" w:hAnsi="Calibri"/>
               </w:rPr>
-              <w:t xml:space="preserve">~0% anual</w:t>
+              <w:t>~0% per year</w:t>
             </w:r>
           </w:p>
         </w:tc>
@@ -821,7 +817,7 @@
                 <w:szCs w:val="18"/>
                 <w:rFonts w:ascii="Calibri" w:cs="Calibri" w:eastAsia="Calibri" w:hAnsi="Calibri"/>
               </w:rPr>
-              <w:t xml:space="preserve">Crecer = tomar cuota y recompra, no "mercado nuevo".</w:t>
+              <w:t>Growth = gaining market share and repeat purchases, not a "new market".</w:t>
             </w:r>
           </w:p>
         </w:tc>
@@ -841,7 +837,7 @@
           <w:szCs w:val="25"/>
           <w:rFonts w:ascii="Georgia" w:cs="Georgia" w:eastAsia="Georgia" w:hAnsi="Georgia"/>
         </w:rPr>
-        <w:t xml:space="preserve">2.2 Lo digital: móvil primero</w:t>
+        <w:t>2.2 Digital: mobile first</w:t>
       </w:r>
     </w:p>
     <w:tbl>
@@ -890,7 +886,7 @@
                 <w:szCs w:val="18"/>
                 <w:rFonts w:ascii="Calibri" w:cs="Calibri" w:eastAsia="Calibri" w:hAnsi="Calibri"/>
               </w:rPr>
-              <w:t xml:space="preserve">Dato (2025)</w:t>
+              <w:t>Data point (2025)</w:t>
             </w:r>
           </w:p>
         </w:tc>
@@ -919,7 +915,7 @@
                 <w:szCs w:val="18"/>
                 <w:rFonts w:ascii="Calibri" w:cs="Calibri" w:eastAsia="Calibri" w:hAnsi="Calibri"/>
               </w:rPr>
-              <w:t xml:space="preserve">Cifra</w:t>
+              <w:t>Figure</w:t>
             </w:r>
           </w:p>
         </w:tc>
@@ -948,7 +944,7 @@
                 <w:szCs w:val="18"/>
                 <w:rFonts w:ascii="Calibri" w:cs="Calibri" w:eastAsia="Calibri" w:hAnsi="Calibri"/>
               </w:rPr>
-              <w:t xml:space="preserve">Implicación</w:t>
+              <w:t>Implication</w:t>
             </w:r>
           </w:p>
         </w:tc>
@@ -979,7 +975,7 @@
                 <w:szCs w:val="18"/>
                 <w:rFonts w:ascii="Calibri" w:cs="Calibri" w:eastAsia="Calibri" w:hAnsi="Calibri"/>
               </w:rPr>
-              <w:t xml:space="preserve">Usuarios de internet</w:t>
+              <w:t>Internet users</w:t>
             </w:r>
           </w:p>
         </w:tc>
@@ -1008,7 +1004,7 @@
                 <w:szCs w:val="18"/>
                 <w:rFonts w:ascii="Calibri" w:cs="Calibri" w:eastAsia="Calibri" w:hAnsi="Calibri"/>
               </w:rPr>
-              <w:t xml:space="preserve">126.000 (68,1%)</w:t>
+              <w:t>126,000 (68.1%)</w:t>
             </w:r>
           </w:p>
         </w:tc>
@@ -1037,7 +1033,7 @@
                 <w:szCs w:val="18"/>
                 <w:rFonts w:ascii="Calibri" w:cs="Calibri" w:eastAsia="Calibri" w:hAnsi="Calibri"/>
               </w:rPr>
-              <w:t xml:space="preserve">Dos de cada tres personas están en línea: hay mercado digital real.</w:t>
+              <w:t>Two out of three people are online: there is a real digital market.</w:t>
             </w:r>
           </w:p>
         </w:tc>
@@ -1068,7 +1064,7 @@
                 <w:szCs w:val="18"/>
                 <w:rFonts w:ascii="Calibri" w:cs="Calibri" w:eastAsia="Calibri" w:hAnsi="Calibri"/>
               </w:rPr>
-              <w:t xml:space="preserve">Conexiones móviles</w:t>
+              <w:t>Mobile connections</w:t>
             </w:r>
           </w:p>
         </w:tc>
@@ -1097,7 +1093,7 @@
                 <w:szCs w:val="18"/>
                 <w:rFonts w:ascii="Calibri" w:cs="Calibri" w:eastAsia="Calibri" w:hAnsi="Calibri"/>
               </w:rPr>
-              <w:t xml:space="preserve">192.000 (104% de la población)</w:t>
+              <w:t>192,000 (104% of the population)</w:t>
             </w:r>
           </w:p>
         </w:tc>
@@ -1126,7 +1122,7 @@
                 <w:szCs w:val="18"/>
                 <w:rFonts w:ascii="Calibri" w:cs="Calibri" w:eastAsia="Calibri" w:hAnsi="Calibri"/>
               </w:rPr>
-              <w:t xml:space="preserve">MÓVIL PRIMERO: el checkout y el catálogo deben brillar en el teléfono.</w:t>
+              <w:t>MOBILE FIRST: checkout and the catalogue must shine on the phone.</w:t>
             </w:r>
           </w:p>
         </w:tc>
@@ -1157,7 +1153,7 @@
                 <w:szCs w:val="18"/>
                 <w:rFonts w:ascii="Calibri" w:cs="Calibri" w:eastAsia="Calibri" w:hAnsi="Calibri"/>
               </w:rPr>
-              <w:t xml:space="preserve">Banda ancha móvil (3G/4G/5G)</w:t>
+              <w:t>Mobile broadband (3G/4G/5G)</w:t>
             </w:r>
           </w:p>
         </w:tc>
@@ -1186,7 +1182,7 @@
                 <w:szCs w:val="18"/>
                 <w:rFonts w:ascii="Calibri" w:cs="Calibri" w:eastAsia="Calibri" w:hAnsi="Calibri"/>
               </w:rPr>
-              <w:t xml:space="preserve">93,1%</w:t>
+              <w:t>93.1%</w:t>
             </w:r>
           </w:p>
         </w:tc>
@@ -1215,7 +1211,7 @@
                 <w:szCs w:val="18"/>
                 <w:rFonts w:ascii="Calibri" w:cs="Calibri" w:eastAsia="Calibri" w:hAnsi="Calibri"/>
               </w:rPr>
-              <w:t xml:space="preserve">Se puede asumir buena conexión, pero optimizar imágenes igual.</w:t>
+              <w:t>A good connection can be assumed, but images should still be optimised.</w:t>
             </w:r>
           </w:p>
         </w:tc>
@@ -1246,7 +1242,7 @@
                 <w:szCs w:val="18"/>
                 <w:rFonts w:ascii="Calibri" w:cs="Calibri" w:eastAsia="Calibri" w:hAnsi="Calibri"/>
               </w:rPr>
-              <w:t xml:space="preserve">Usuarios de redes sociales</w:t>
+              <w:t>Social media users</w:t>
             </w:r>
           </w:p>
         </w:tc>
@@ -1275,7 +1271,7 @@
                 <w:szCs w:val="18"/>
                 <w:rFonts w:ascii="Calibri" w:cs="Calibri" w:eastAsia="Calibri" w:hAnsi="Calibri"/>
               </w:rPr>
-              <w:t xml:space="preserve">107.000 (57,8%)</w:t>
+              <w:t>107,000 (57.8%)</w:t>
             </w:r>
           </w:p>
         </w:tc>
@@ -1304,7 +1300,7 @@
                 <w:szCs w:val="18"/>
                 <w:rFonts w:ascii="Calibri" w:cs="Calibri" w:eastAsia="Calibri" w:hAnsi="Calibri"/>
               </w:rPr>
-              <w:t xml:space="preserve">Las redes son el canal de adquisición principal.</w:t>
+              <w:t>Social media is the main acquisition channel.</w:t>
             </w:r>
           </w:p>
         </w:tc>
@@ -1332,7 +1328,7 @@
           <w:szCs w:val="22"/>
           <w:rFonts w:ascii="Calibri" w:cs="Calibri" w:eastAsia="Calibri" w:hAnsi="Calibri"/>
         </w:rPr>
-        <w:t xml:space="preserve">¿Dónde está tu clienta? (redes 2025)</w:t>
+        <w:t>Where is your customer? (social media 2025)</w:t>
       </w:r>
     </w:p>
     <w:tbl>
@@ -1381,7 +1377,7 @@
                 <w:szCs w:val="18"/>
                 <w:rFonts w:ascii="Calibri" w:cs="Calibri" w:eastAsia="Calibri" w:hAnsi="Calibri"/>
               </w:rPr>
-              <w:t xml:space="preserve">Plataforma</w:t>
+              <w:t>Platform</w:t>
             </w:r>
           </w:p>
         </w:tc>
@@ -1410,7 +1406,7 @@
                 <w:szCs w:val="18"/>
                 <w:rFonts w:ascii="Calibri" w:cs="Calibri" w:eastAsia="Calibri" w:hAnsi="Calibri"/>
               </w:rPr>
-              <w:t xml:space="preserve">Alcance</w:t>
+              <w:t>Reach</w:t>
             </w:r>
           </w:p>
         </w:tc>
@@ -1439,7 +1435,7 @@
                 <w:szCs w:val="18"/>
                 <w:rFonts w:ascii="Calibri" w:cs="Calibri" w:eastAsia="Calibri" w:hAnsi="Calibri"/>
               </w:rPr>
-              <w:t xml:space="preserve">Uso sugerido</w:t>
+              <w:t>Suggested use</w:t>
             </w:r>
           </w:p>
         </w:tc>
@@ -1470,7 +1466,7 @@
                 <w:szCs w:val="18"/>
                 <w:rFonts w:ascii="Calibri" w:cs="Calibri" w:eastAsia="Calibri" w:hAnsi="Calibri"/>
               </w:rPr>
-              <w:t xml:space="preserve">Facebook</w:t>
+              <w:t>Facebook</w:t>
             </w:r>
           </w:p>
         </w:tc>
@@ -1499,7 +1495,7 @@
                 <w:szCs w:val="18"/>
                 <w:rFonts w:ascii="Calibri" w:cs="Calibri" w:eastAsia="Calibri" w:hAnsi="Calibri"/>
               </w:rPr>
-              <w:t xml:space="preserve">107.000 (57,8%)</w:t>
+              <w:t>107,000 (57.8%)</w:t>
             </w:r>
           </w:p>
         </w:tc>
@@ -1528,7 +1524,7 @@
                 <w:szCs w:val="18"/>
                 <w:rFonts w:ascii="Calibri" w:cs="Calibri" w:eastAsia="Calibri" w:hAnsi="Calibri"/>
               </w:rPr>
-              <w:t xml:space="preserve">Alcance amplio, incluye público maduro. Catálogo + anuncios.</w:t>
+              <w:t>Broad reach, including a mature audience. Catalogue + ads.</w:t>
             </w:r>
           </w:p>
         </w:tc>
@@ -1559,7 +1555,7 @@
                 <w:szCs w:val="18"/>
                 <w:rFonts w:ascii="Calibri" w:cs="Calibri" w:eastAsia="Calibri" w:hAnsi="Calibri"/>
               </w:rPr>
-              <w:t xml:space="preserve">TikTok</w:t>
+              <w:t>TikTok</w:t>
             </w:r>
           </w:p>
         </w:tc>
@@ -1588,7 +1584,7 @@
                 <w:szCs w:val="18"/>
                 <w:rFonts w:ascii="Calibri" w:cs="Calibri" w:eastAsia="Calibri" w:hAnsi="Calibri"/>
               </w:rPr>
-              <w:t xml:space="preserve">96.000 adultos (63,1%)</w:t>
+              <w:t>96,000 adults (63.1%)</w:t>
             </w:r>
           </w:p>
         </w:tc>
@@ -1617,7 +1613,7 @@
                 <w:szCs w:val="18"/>
                 <w:rFonts w:ascii="Calibri" w:cs="Calibri" w:eastAsia="Calibri" w:hAnsi="Calibri"/>
               </w:rPr>
-              <w:t xml:space="preserve">Descubrimiento y video de producto. Alto potencial.</w:t>
+              <w:t>Discovery and product video. High potential.</w:t>
             </w:r>
           </w:p>
         </w:tc>
@@ -1648,7 +1644,7 @@
                 <w:szCs w:val="18"/>
                 <w:rFonts w:ascii="Calibri" w:cs="Calibri" w:eastAsia="Calibri" w:hAnsi="Calibri"/>
               </w:rPr>
-              <w:t xml:space="preserve">Instagram</w:t>
+              <w:t>Instagram</w:t>
             </w:r>
           </w:p>
         </w:tc>
@@ -1677,7 +1673,7 @@
                 <w:szCs w:val="18"/>
                 <w:rFonts w:ascii="Calibri" w:cs="Calibri" w:eastAsia="Calibri" w:hAnsi="Calibri"/>
               </w:rPr>
-              <w:t xml:space="preserve">64.100 (34,6%)</w:t>
+              <w:t>64,100 (34.6%)</w:t>
             </w:r>
           </w:p>
         </w:tc>
@@ -1706,7 +1702,7 @@
                 <w:szCs w:val="18"/>
                 <w:rFonts w:ascii="Calibri" w:cs="Calibri" w:eastAsia="Calibri" w:hAnsi="Calibri"/>
               </w:rPr>
-              <w:t xml:space="preserve">Estética de marca, lencería/belleza, influencers locales.</w:t>
+              <w:t>Brand aesthetics, lingerie/beauty, local influencers.</w:t>
             </w:r>
           </w:p>
         </w:tc>
@@ -1737,7 +1733,7 @@
                 <w:szCs w:val="18"/>
                 <w:rFonts w:ascii="Calibri" w:cs="Calibri" w:eastAsia="Calibri" w:hAnsi="Calibri"/>
               </w:rPr>
-              <w:t xml:space="preserve">Messenger / WhatsApp</w:t>
+              <w:t>Messenger / WhatsApp</w:t>
             </w:r>
           </w:p>
         </w:tc>
@@ -1766,7 +1762,7 @@
                 <w:szCs w:val="18"/>
                 <w:rFonts w:ascii="Calibri" w:cs="Calibri" w:eastAsia="Calibri" w:hAnsi="Calibri"/>
               </w:rPr>
-              <w:t xml:space="preserve">Muy alto uso</w:t>
+              <w:t>Very high usage</w:t>
             </w:r>
           </w:p>
         </w:tc>
@@ -1795,7 +1791,7 @@
                 <w:szCs w:val="18"/>
                 <w:rFonts w:ascii="Calibri" w:cs="Calibri" w:eastAsia="Calibri" w:hAnsi="Calibri"/>
               </w:rPr>
-              <w:t xml:space="preserve">Atención y cierre de venta — ya tienes chatbot listo.</w:t>
+              <w:t>Customer service and closing the sale — you already have a chatbot ready.</w:t>
             </w:r>
           </w:p>
         </w:tc>
@@ -1815,7 +1811,7 @@
           <w:szCs w:val="25"/>
           <w:rFonts w:ascii="Georgia" w:cs="Georgia" w:eastAsia="Georgia" w:hAnsi="Georgia"/>
         </w:rPr>
-        <w:t xml:space="preserve">2.3 Pagos: el factor de confianza local</w:t>
+        <w:t>2.3 Payments: the local trust factor</w:t>
       </w:r>
     </w:p>
     <w:p>
@@ -1838,7 +1834,7 @@
           <w:szCs w:val="21"/>
           <w:rFonts w:ascii="Calibri" w:cs="Calibri" w:eastAsia="Calibri" w:hAnsi="Calibri"/>
         </w:rPr>
-        <w:t xml:space="preserve">Sentoo + MCB: </w:t>
+        <w:t>Sentoo + MCB: Sentoo is the local payment method of the Dutch Caribbean and integrates directly with MCB bank and others (Banco di Caribe, Orco, WIB, etc.). The customer pays from their own account using bank authentication (fingerprint, face, token). It is free for the consumer.</w:t>
       </w:r>
       <w:r>
         <w:rPr>
@@ -1851,7 +1847,6 @@
           <w:szCs w:val="21"/>
           <w:rFonts w:ascii="Calibri" w:cs="Calibri" w:eastAsia="Calibri" w:hAnsi="Calibri"/>
         </w:rPr>
-        <w:t xml:space="preserve">Sentoo es el método de pago local del Caribe holandés e integra directamente con el banco MCB y otros (Banco di Caribe, Orco, WIB, etc.). El cliente paga desde su cuenta con autenticación del banco (huella, cara, token). Es gratis para el consumidor.</w:t>
       </w:r>
     </w:p>
     <w:p>
@@ -1874,7 +1869,7 @@
           <w:szCs w:val="21"/>
           <w:rFonts w:ascii="Calibri" w:cs="Calibri" w:eastAsia="Calibri" w:hAnsi="Calibri"/>
         </w:rPr>
-        <w:t xml:space="preserve">Implicación: </w:t>
+        <w:t>Implication: Sentoo is probably the most trusted local method. Your store ALREADY integrates it — prioritising its activation and testing is key (see US-C2 in Doc 2).</w:t>
       </w:r>
       <w:r>
         <w:rPr>
@@ -1887,7 +1882,6 @@
           <w:szCs w:val="21"/>
           <w:rFonts w:ascii="Calibri" w:cs="Calibri" w:eastAsia="Calibri" w:hAnsi="Calibri"/>
         </w:rPr>
-        <w:t xml:space="preserve">Sentoo es probablemente el método de mayor confianza local. Tu tienda YA lo integra — priorizar su activación y prueba es clave (ver US-C2 del Doc 2).</w:t>
       </w:r>
     </w:p>
     <w:p>
@@ -1910,7 +1904,7 @@
           <w:szCs w:val="21"/>
           <w:rFonts w:ascii="Calibri" w:cs="Calibri" w:eastAsia="Calibri" w:hAnsi="Calibri"/>
         </w:rPr>
-        <w:t xml:space="preserve">Además: </w:t>
+        <w:t>In addition: Sentoo also offers Visa, Mastercard and iDEAL. Combined with cash on delivery and WhatsApp, you cover almost every preference.</w:t>
       </w:r>
       <w:r>
         <w:rPr>
@@ -1923,7 +1917,6 @@
           <w:szCs w:val="21"/>
           <w:rFonts w:ascii="Calibri" w:cs="Calibri" w:eastAsia="Calibri" w:hAnsi="Calibri"/>
         </w:rPr>
-        <w:t xml:space="preserve">Sentoo también ofrece Visa, Mastercard e iDEAL. Combinado con contra-entrega y WhatsApp, cubres casi todas las preferencias.</w:t>
       </w:r>
     </w:p>
     <w:p>
@@ -1940,7 +1933,7 @@
           <w:szCs w:val="25"/>
           <w:rFonts w:ascii="Georgia" w:cs="Georgia" w:eastAsia="Georgia" w:hAnsi="Georgia"/>
         </w:rPr>
-        <w:t xml:space="preserve">2.4 Idioma</w:t>
+        <w:t>2.4 Language</w:t>
       </w:r>
     </w:p>
     <w:p>
@@ -1963,7 +1956,7 @@
           <w:szCs w:val="21"/>
           <w:rFonts w:ascii="Calibri" w:cs="Calibri" w:eastAsia="Calibri" w:hAnsi="Calibri"/>
         </w:rPr>
-        <w:t xml:space="preserve">Papiamentu es la lengua materna del ~81% </w:t>
+        <w:t>Papiamentu is the mother tongue of ~81% of the population. Dutch (government/education), English and Spanish are also common.</w:t>
       </w:r>
       <w:r>
         <w:rPr>
@@ -1976,7 +1969,6 @@
           <w:szCs w:val="21"/>
           <w:rFonts w:ascii="Calibri" w:cs="Calibri" w:eastAsia="Calibri" w:hAnsi="Calibri"/>
         </w:rPr>
-        <w:t xml:space="preserve">de la población. Neerlandés (gobierno/educación), inglés y español también son comunes.</w:t>
       </w:r>
     </w:p>
     <w:p>
@@ -1999,7 +1991,7 @@
           <w:szCs w:val="21"/>
           <w:rFonts w:ascii="Calibri" w:cs="Calibri" w:eastAsia="Calibri" w:hAnsi="Calibri"/>
         </w:rPr>
-        <w:t xml:space="preserve">Implicación: </w:t>
+        <w:t>Implication: the interface is currently in English. Research (Doc 3, area D) which language your customer prefers to shop in. The WhatsApp chatbot already replies in Papiamentu — a good sign of localisation.</w:t>
       </w:r>
       <w:r>
         <w:rPr>
@@ -2012,7 +2004,6 @@
           <w:szCs w:val="21"/>
           <w:rFonts w:ascii="Calibri" w:cs="Calibri" w:eastAsia="Calibri" w:hAnsi="Calibri"/>
         </w:rPr>
-        <w:t xml:space="preserve">la interfaz hoy está en inglés. Investigar (Doc 3, área D) qué idioma prefiere tu clienta para comprar. El chatbot de WhatsApp ya responde en papiamentu — buena señal de localización.</w:t>
       </w:r>
     </w:p>
     <w:p>
@@ -2063,7 +2054,7 @@
                 <w:szCs w:val="21"/>
                 <w:rFonts w:ascii="Calibri" w:cs="Calibri" w:eastAsia="Calibri" w:hAnsi="Calibri"/>
               </w:rPr>
-              <w:t xml:space="preserve">Síntesis: 5 insights que deben guiar el diseño</w:t>
+              <w:t>Synthesis: 5 insights that should guide the design</w:t>
             </w:r>
           </w:p>
           <w:p>
@@ -2077,7 +2068,7 @@
                 <w:szCs w:val="20"/>
                 <w:rFonts w:ascii="Calibri" w:cs="Calibri" w:eastAsia="Calibri" w:hAnsi="Calibri"/>
               </w:rPr>
-              <w:t xml:space="preserve">1. MÓVIL PRIMERO — más conexiones móviles que personas. El teléfono es LA pantalla.</w:t>
+              <w:t>1. MOBILE FIRST — more mobile connections than people. The phone is THE screen.</w:t>
             </w:r>
           </w:p>
           <w:p>
@@ -2091,7 +2082,7 @@
                 <w:szCs w:val="20"/>
                 <w:rFonts w:ascii="Calibri" w:cs="Calibri" w:eastAsia="Calibri" w:hAnsi="Calibri"/>
               </w:rPr>
-              <w:t xml:space="preserve">2. CONFIANZA LOCAL — Sentoo/MCB y señales de confianza vencen la duda de "comprar en línea aquí".</w:t>
+              <w:t>2. LOCAL TRUST — Sentoo/MCB and trust signals overcome the doubt about "buying online here".</w:t>
             </w:r>
           </w:p>
           <w:p>
@@ -2105,7 +2096,7 @@
                 <w:szCs w:val="20"/>
                 <w:rFonts w:ascii="Calibri" w:cs="Calibri" w:eastAsia="Calibri" w:hAnsi="Calibri"/>
               </w:rPr>
-              <w:t xml:space="preserve">3. REDES = TIENDA — Facebook/TikTok/Instagram son la vitrina; WhatsApp cierra la venta.</w:t>
+              <w:t>3. SOCIAL = STORE — Facebook/TikTok/Instagram are the shop window; WhatsApp closes the sale.</w:t>
             </w:r>
           </w:p>
           <w:p>
@@ -2119,7 +2110,7 @@
                 <w:szCs w:val="20"/>
                 <w:rFonts w:ascii="Calibri" w:cs="Calibri" w:eastAsia="Calibri" w:hAnsi="Calibri"/>
               </w:rPr>
-              <w:t xml:space="preserve">4. MERCADO PEQUEÑO — fidelidad, recompra y boca a boca valen más que el tráfico masivo.</w:t>
+              <w:t>4. SMALL MARKET — loyalty, repeat purchases and word of mouth are worth more than mass traffic.</w:t>
             </w:r>
           </w:p>
           <w:p>
@@ -2133,7 +2124,7 @@
                 <w:szCs w:val="20"/>
                 <w:rFonts w:ascii="Calibri" w:cs="Calibri" w:eastAsia="Calibri" w:hAnsi="Calibri"/>
               </w:rPr>
-              <w:t xml:space="preserve">5. MULTILINGÜE — papiamentu manda; decidir idioma de interfaz con datos, no por defecto inglés.</w:t>
+              <w:t>5. MULTILINGUAL — Papiamentu rules; decide the interface language based on data, not English by default.</w:t>
             </w:r>
           </w:p>
         </w:tc>
@@ -2161,7 +2152,7 @@
           <w:szCs w:val="30"/>
           <w:rFonts w:ascii="Georgia" w:cs="Georgia" w:eastAsia="Georgia" w:hAnsi="Georgia"/>
         </w:rPr>
-        <w:t xml:space="preserve">3. Retos estratégicos (para enfocar la sesión)</w:t>
+        <w:t>3. Strategic challenges (to focus the session)</w:t>
       </w:r>
     </w:p>
     <w:p>
@@ -2180,7 +2171,7 @@
           <w:szCs w:val="21"/>
           <w:rFonts w:ascii="Calibri" w:cs="Calibri" w:eastAsia="Calibri" w:hAnsi="Calibri"/>
         </w:rPr>
-        <w:t xml:space="preserve">De la investigación surgen retos centrales. Elijan 2–3 como foco del brainstorming. Están redactados como "problem statements".</w:t>
+        <w:t>Core challenges emerge from the research. Choose 2–3 as the focus of the brainstorming. They are written as "problem statements".</w:t>
       </w:r>
     </w:p>
     <w:tbl>
@@ -2229,7 +2220,7 @@
                 <w:szCs w:val="18"/>
                 <w:rFonts w:ascii="Calibri" w:cs="Calibri" w:eastAsia="Calibri" w:hAnsi="Calibri"/>
               </w:rPr>
-              <w:t xml:space="preserve">#</w:t>
+              <w:t>#</w:t>
             </w:r>
           </w:p>
         </w:tc>
@@ -2258,7 +2249,7 @@
                 <w:szCs w:val="18"/>
                 <w:rFonts w:ascii="Calibri" w:cs="Calibri" w:eastAsia="Calibri" w:hAnsi="Calibri"/>
               </w:rPr>
-              <w:t xml:space="preserve">Reto estratégico</w:t>
+              <w:t>Strategic challenge</w:t>
             </w:r>
           </w:p>
         </w:tc>
@@ -2287,7 +2278,7 @@
                 <w:szCs w:val="18"/>
                 <w:rFonts w:ascii="Calibri" w:cs="Calibri" w:eastAsia="Calibri" w:hAnsi="Calibri"/>
               </w:rPr>
-              <w:t xml:space="preserve">Disciplinas</w:t>
+              <w:t>Disciplines</w:t>
             </w:r>
           </w:p>
         </w:tc>
@@ -2318,7 +2309,7 @@
                 <w:szCs w:val="18"/>
                 <w:rFonts w:ascii="Calibri" w:cs="Calibri" w:eastAsia="Calibri" w:hAnsi="Calibri"/>
               </w:rPr>
-              <w:t xml:space="preserve">R1</w:t>
+              <w:t>R1</w:t>
             </w:r>
           </w:p>
         </w:tc>
@@ -2347,7 +2338,7 @@
                 <w:szCs w:val="18"/>
                 <w:rFonts w:ascii="Calibri" w:cs="Calibri" w:eastAsia="Calibri" w:hAnsi="Calibri"/>
               </w:rPr>
-              <w:t xml:space="preserve">Cómo generar confianza para que una clienta de Curaçao compre productos íntimos en línea por primera vez.</w:t>
+              <w:t>How to build trust so that a customer in Curaçao buys intimate products online for the first time.</w:t>
             </w:r>
           </w:p>
         </w:tc>
@@ -2376,7 +2367,7 @@
                 <w:szCs w:val="18"/>
                 <w:rFonts w:ascii="Calibri" w:cs="Calibri" w:eastAsia="Calibri" w:hAnsi="Calibri"/>
               </w:rPr>
-              <w:t xml:space="preserve">UX · Marketing · Contenido</w:t>
+              <w:t>UX · Marketing · Content</w:t>
             </w:r>
           </w:p>
         </w:tc>
@@ -2407,7 +2398,7 @@
                 <w:szCs w:val="18"/>
                 <w:rFonts w:ascii="Calibri" w:cs="Calibri" w:eastAsia="Calibri" w:hAnsi="Calibri"/>
               </w:rPr>
-              <w:t xml:space="preserve">R2</w:t>
+              <w:t>R2</w:t>
             </w:r>
           </w:p>
         </w:tc>
@@ -2436,7 +2427,7 @@
                 <w:szCs w:val="18"/>
                 <w:rFonts w:ascii="Calibri" w:cs="Calibri" w:eastAsia="Calibri" w:hAnsi="Calibri"/>
               </w:rPr>
-              <w:t xml:space="preserve">Cómo hacer el checkout móvil tan simple que se complete en menos de 2 minutos.</w:t>
+              <w:t>How to make mobile checkout so simple that it can be completed in under 2 minutes.</w:t>
             </w:r>
           </w:p>
         </w:tc>
@@ -2465,7 +2456,7 @@
                 <w:szCs w:val="18"/>
                 <w:rFonts w:ascii="Calibri" w:cs="Calibri" w:eastAsia="Calibri" w:hAnsi="Calibri"/>
               </w:rPr>
-              <w:t xml:space="preserve">UX · Frontend</w:t>
+              <w:t>UX · Frontend</w:t>
             </w:r>
           </w:p>
         </w:tc>
@@ -2496,7 +2487,7 @@
                 <w:szCs w:val="18"/>
                 <w:rFonts w:ascii="Calibri" w:cs="Calibri" w:eastAsia="Calibri" w:hAnsi="Calibri"/>
               </w:rPr>
-              <w:t xml:space="preserve">R3</w:t>
+              <w:t>R3</w:t>
             </w:r>
           </w:p>
         </w:tc>
@@ -2525,7 +2516,7 @@
                 <w:szCs w:val="18"/>
                 <w:rFonts w:ascii="Calibri" w:cs="Calibri" w:eastAsia="Calibri" w:hAnsi="Calibri"/>
               </w:rPr>
-              <w:t xml:space="preserve">Cómo convertir el delivery en un diferenciador (claridad de zonas, tiempos, seguimiento).</w:t>
+              <w:t>How to turn delivery into a differentiator (clear zones, timing, tracking).</w:t>
             </w:r>
           </w:p>
         </w:tc>
@@ -2554,7 +2545,7 @@
                 <w:szCs w:val="18"/>
                 <w:rFonts w:ascii="Calibri" w:cs="Calibri" w:eastAsia="Calibri" w:hAnsi="Calibri"/>
               </w:rPr>
-              <w:t xml:space="preserve">Ops · UX · Backend</w:t>
+              <w:t>Ops · UX · Backend</w:t>
             </w:r>
           </w:p>
         </w:tc>
@@ -2585,7 +2576,7 @@
                 <w:szCs w:val="18"/>
                 <w:rFonts w:ascii="Calibri" w:cs="Calibri" w:eastAsia="Calibri" w:hAnsi="Calibri"/>
               </w:rPr>
-              <w:t xml:space="preserve">R4</w:t>
+              <w:t>R4</w:t>
             </w:r>
           </w:p>
         </w:tc>
@@ -2614,7 +2605,7 @@
                 <w:szCs w:val="18"/>
                 <w:rFonts w:ascii="Calibri" w:cs="Calibri" w:eastAsia="Calibri" w:hAnsi="Calibri"/>
               </w:rPr>
-              <w:t xml:space="preserve">Cómo aprovechar WhatsApp y redes para vender y fidelizar en un mercado pequeño.</w:t>
+              <w:t>How to leverage WhatsApp and social media to sell and build loyalty in a small market.</w:t>
             </w:r>
           </w:p>
         </w:tc>
@@ -2643,7 +2634,7 @@
                 <w:szCs w:val="18"/>
                 <w:rFonts w:ascii="Calibri" w:cs="Calibri" w:eastAsia="Calibri" w:hAnsi="Calibri"/>
               </w:rPr>
-              <w:t xml:space="preserve">Marketing · Backend</w:t>
+              <w:t>Marketing · Backend</w:t>
             </w:r>
           </w:p>
         </w:tc>
@@ -2674,7 +2665,7 @@
                 <w:szCs w:val="18"/>
                 <w:rFonts w:ascii="Calibri" w:cs="Calibri" w:eastAsia="Calibri" w:hAnsi="Calibri"/>
               </w:rPr>
-              <w:t xml:space="preserve">R5</w:t>
+              <w:t>R5</w:t>
             </w:r>
           </w:p>
         </w:tc>
@@ -2703,7 +2694,7 @@
                 <w:szCs w:val="18"/>
                 <w:rFonts w:ascii="Calibri" w:cs="Calibri" w:eastAsia="Calibri" w:hAnsi="Calibri"/>
               </w:rPr>
-              <w:t xml:space="preserve">Cómo resolver la barrera de la talla (lencería) para reducir dudas y devoluciones.</w:t>
+              <w:t>How to overcome the size barrier (lingerie) to reduce doubts and returns.</w:t>
             </w:r>
           </w:p>
         </w:tc>
@@ -2732,7 +2723,7 @@
                 <w:szCs w:val="18"/>
                 <w:rFonts w:ascii="Calibri" w:cs="Calibri" w:eastAsia="Calibri" w:hAnsi="Calibri"/>
               </w:rPr>
-              <w:t xml:space="preserve">UX · Producto</w:t>
+              <w:t>UX · Product</w:t>
             </w:r>
           </w:p>
         </w:tc>
@@ -2763,7 +2754,7 @@
                 <w:szCs w:val="18"/>
                 <w:rFonts w:ascii="Calibri" w:cs="Calibri" w:eastAsia="Calibri" w:hAnsi="Calibri"/>
               </w:rPr>
-              <w:t xml:space="preserve">R6</w:t>
+              <w:t>R6</w:t>
             </w:r>
           </w:p>
         </w:tc>
@@ -2792,7 +2783,7 @@
                 <w:szCs w:val="18"/>
                 <w:rFonts w:ascii="Calibri" w:cs="Calibri" w:eastAsia="Calibri" w:hAnsi="Calibri"/>
               </w:rPr>
-              <w:t xml:space="preserve">Cómo decidir el idioma correcto sin fragmentar el esfuerzo.</w:t>
+              <w:t>How to choose the right language without fragmenting the effort.</w:t>
             </w:r>
           </w:p>
         </w:tc>
@@ -2821,7 +2812,7 @@
                 <w:szCs w:val="18"/>
                 <w:rFonts w:ascii="Calibri" w:cs="Calibri" w:eastAsia="Calibri" w:hAnsi="Calibri"/>
               </w:rPr>
-              <w:t xml:space="preserve">UX · Contenido</w:t>
+              <w:t>UX · Content</w:t>
             </w:r>
           </w:p>
         </w:tc>
@@ -2849,7 +2840,7 @@
           <w:szCs w:val="30"/>
           <w:rFonts w:ascii="Georgia" w:cs="Georgia" w:eastAsia="Georgia" w:hAnsi="Georgia"/>
         </w:rPr>
-        <w:t xml:space="preserve">4. Preguntas de investigación (Main Q / Sub-Q)</w:t>
+        <w:t>4. Research questions (Main Q / Sub-Q)</w:t>
       </w:r>
     </w:p>
     <w:p>
@@ -2865,7 +2856,7 @@
           <w:szCs w:val="22"/>
           <w:rFonts w:ascii="Calibri" w:cs="Calibri" w:eastAsia="Calibri" w:hAnsi="Calibri"/>
         </w:rPr>
-        <w:t xml:space="preserve">Banco de preguntas por disciplina. Cada una tiene una pregunta principal y sub-preguntas. Repártelas por rol; las respuestas alimentan el plan de acción (Doc 5).</w:t>
+        <w:t>Question bank by discipline. Each has a main question and sub-questions. Assign them by role; the answers feed into the action plan (Doc 5).</w:t>
       </w:r>
     </w:p>
     <w:p>
@@ -2882,7 +2873,7 @@
           <w:szCs w:val="25"/>
           <w:rFonts w:ascii="Georgia" w:cs="Georgia" w:eastAsia="Georgia" w:hAnsi="Georgia"/>
         </w:rPr>
-        <w:t xml:space="preserve">4.1 UX / Investigación de usuaria</w:t>
+        <w:t>4.1 UX / User research</w:t>
       </w:r>
     </w:p>
     <w:p>
@@ -2898,7 +2889,7 @@
           <w:szCs w:val="20"/>
           <w:rFonts w:ascii="Calibri" w:cs="Calibri" w:eastAsia="Calibri" w:hAnsi="Calibri"/>
         </w:rPr>
-        <w:t xml:space="preserve">Q1 · </w:t>
+        <w:t>Q1 · UX</w:t>
       </w:r>
       <w:r>
         <w:rPr>
@@ -2909,7 +2900,6 @@
           <w:szCs w:val="16"/>
           <w:rFonts w:ascii="Calibri" w:cs="Calibri" w:eastAsia="Calibri" w:hAnsi="Calibri"/>
         </w:rPr>
-        <w:t xml:space="preserve">UX</w:t>
       </w:r>
     </w:p>
     <w:p>
@@ -2925,7 +2915,7 @@
           <w:szCs w:val="20"/>
           <w:rFonts w:ascii="Calibri" w:cs="Calibri" w:eastAsia="Calibri" w:hAnsi="Calibri"/>
         </w:rPr>
-        <w:t xml:space="preserve">Pregunta principal: </w:t>
+        <w:t>Main question: Who is the Unistyles customer, and what makes her buy (or hesitate) online?</w:t>
       </w:r>
       <w:r>
         <w:rPr>
@@ -2934,7 +2924,6 @@
           <w:szCs w:val="20"/>
           <w:rFonts w:ascii="Calibri" w:cs="Calibri" w:eastAsia="Calibri" w:hAnsi="Calibri"/>
         </w:rPr>
-        <w:t xml:space="preserve">¿Quién es la clienta de Unistyles y qué la hace comprar (o dudar) en línea?</w:t>
       </w:r>
     </w:p>
     <w:p>
@@ -2953,7 +2942,7 @@
           <w:szCs w:val="19"/>
           <w:rFonts w:ascii="Calibri" w:cs="Calibri" w:eastAsia="Calibri" w:hAnsi="Calibri"/>
         </w:rPr>
-        <w:t xml:space="preserve">¿Cuáles son sus 3 mayores miedos al comprar productos íntimos/belleza en línea?</w:t>
+        <w:t>What are her 3 biggest fears when buying intimate/beauty products online?</w:t>
       </w:r>
     </w:p>
     <w:p>
@@ -2972,7 +2961,7 @@
           <w:szCs w:val="19"/>
           <w:rFonts w:ascii="Calibri" w:cs="Calibri" w:eastAsia="Calibri" w:hAnsi="Calibri"/>
         </w:rPr>
-        <w:t xml:space="preserve">¿Compra para sí o para regalar? ¿En qué ocasiones?</w:t>
+        <w:t>Does she buy for herself or as a gift? On which occasions?</w:t>
       </w:r>
     </w:p>
     <w:p>
@@ -2991,7 +2980,7 @@
           <w:szCs w:val="19"/>
           <w:rFonts w:ascii="Calibri" w:cs="Calibri" w:eastAsia="Calibri" w:hAnsi="Calibri"/>
         </w:rPr>
-        <w:t xml:space="preserve">¿Qué la hizo comprar la última vez en línea, y qué la hizo abandonar?</w:t>
+        <w:t>What made her buy online the last time, and what made her abandon?</w:t>
       </w:r>
     </w:p>
     <w:p>
@@ -3010,7 +2999,7 @@
           <w:szCs w:val="19"/>
           <w:rFonts w:ascii="Calibri" w:cs="Calibri" w:eastAsia="Calibri" w:hAnsi="Calibri"/>
         </w:rPr>
-        <w:t xml:space="preserve">¿Prefiere pedir por WhatsApp o comprar sola en el sitio? ¿Por qué?</w:t>
+        <w:t>Does she prefer ordering via WhatsApp or buying on her own on the site? Why?</w:t>
       </w:r>
     </w:p>
     <w:p>
@@ -3026,7 +3015,7 @@
           <w:szCs w:val="20"/>
           <w:rFonts w:ascii="Calibri" w:cs="Calibri" w:eastAsia="Calibri" w:hAnsi="Calibri"/>
         </w:rPr>
-        <w:t xml:space="preserve">Q2 · </w:t>
+        <w:t>Q2 · UX</w:t>
       </w:r>
       <w:r>
         <w:rPr>
@@ -3037,7 +3026,6 @@
           <w:szCs w:val="16"/>
           <w:rFonts w:ascii="Calibri" w:cs="Calibri" w:eastAsia="Calibri" w:hAnsi="Calibri"/>
         </w:rPr>
-        <w:t xml:space="preserve">UX</w:t>
       </w:r>
     </w:p>
     <w:p>
@@ -3053,7 +3041,7 @@
           <w:szCs w:val="20"/>
           <w:rFonts w:ascii="Calibri" w:cs="Calibri" w:eastAsia="Calibri" w:hAnsi="Calibri"/>
         </w:rPr>
-        <w:t xml:space="preserve">Pregunta principal: </w:t>
+        <w:t>Main question: Where is the friction in the current purchase journey?</w:t>
       </w:r>
       <w:r>
         <w:rPr>
@@ -3062,7 +3050,6 @@
           <w:szCs w:val="20"/>
           <w:rFonts w:ascii="Calibri" w:cs="Calibri" w:eastAsia="Calibri" w:hAnsi="Calibri"/>
         </w:rPr>
-        <w:t xml:space="preserve">¿Dónde está la fricción en el recorrido de compra actual?</w:t>
       </w:r>
     </w:p>
     <w:p>
@@ -3081,7 +3068,7 @@
           <w:szCs w:val="19"/>
           <w:rFonts w:ascii="Calibri" w:cs="Calibri" w:eastAsia="Calibri" w:hAnsi="Calibri"/>
         </w:rPr>
-        <w:t xml:space="preserve">¿En qué paso del checkout duda o se detiene?</w:t>
+        <w:t>At which checkout step does she hesitate or stop?</w:t>
       </w:r>
     </w:p>
     <w:p>
@@ -3100,7 +3087,7 @@
           <w:szCs w:val="19"/>
           <w:rFonts w:ascii="Calibri" w:cs="Calibri" w:eastAsia="Calibri" w:hAnsi="Calibri"/>
         </w:rPr>
-        <w:t xml:space="preserve">¿Encuentra el producto que busca fácilmente (búsqueda vs. categoría vs. marca)?</w:t>
+        <w:t>Does she easily find the product she is looking for (search vs. category vs. brand)?</w:t>
       </w:r>
     </w:p>
     <w:p>
@@ -3119,7 +3106,7 @@
           <w:szCs w:val="19"/>
           <w:rFonts w:ascii="Calibri" w:cs="Calibri" w:eastAsia="Calibri" w:hAnsi="Calibri"/>
         </w:rPr>
-        <w:t xml:space="preserve">¿La guía de tallas le da seguridad para comprar?</w:t>
+        <w:t>Does the size guide give her the confidence to buy?</w:t>
       </w:r>
     </w:p>
     <w:p>
@@ -3136,7 +3123,7 @@
           <w:szCs w:val="25"/>
           <w:rFonts w:ascii="Georgia" w:cs="Georgia" w:eastAsia="Georgia" w:hAnsi="Georgia"/>
         </w:rPr>
-        <w:t xml:space="preserve">4.2 UI / Diseño visual</w:t>
+        <w:t>4.2 UI / Visual design</w:t>
       </w:r>
     </w:p>
     <w:p>
@@ -3152,7 +3139,7 @@
           <w:szCs w:val="20"/>
           <w:rFonts w:ascii="Calibri" w:cs="Calibri" w:eastAsia="Calibri" w:hAnsi="Calibri"/>
         </w:rPr>
-        <w:t xml:space="preserve">Q3 · </w:t>
+        <w:t>Q3 · UI</w:t>
       </w:r>
       <w:r>
         <w:rPr>
@@ -3163,7 +3150,6 @@
           <w:szCs w:val="16"/>
           <w:rFonts w:ascii="Calibri" w:cs="Calibri" w:eastAsia="Calibri" w:hAnsi="Calibri"/>
         </w:rPr>
-        <w:t xml:space="preserve">UI</w:t>
       </w:r>
     </w:p>
     <w:p>
@@ -3179,7 +3165,7 @@
           <w:szCs w:val="20"/>
           <w:rFonts w:ascii="Calibri" w:cs="Calibri" w:eastAsia="Calibri" w:hAnsi="Calibri"/>
         </w:rPr>
-        <w:t xml:space="preserve">Pregunta principal: </w:t>
+        <w:t>Main question: Which aesthetic creates desire and trust for this customer?</w:t>
       </w:r>
       <w:r>
         <w:rPr>
@@ -3188,7 +3174,6 @@
           <w:szCs w:val="20"/>
           <w:rFonts w:ascii="Calibri" w:cs="Calibri" w:eastAsia="Calibri" w:hAnsi="Calibri"/>
         </w:rPr>
-        <w:t xml:space="preserve">¿Qué estética genera deseo y confianza para esta clienta?</w:t>
       </w:r>
     </w:p>
     <w:p>
@@ -3207,7 +3192,7 @@
           <w:szCs w:val="19"/>
           <w:rFonts w:ascii="Calibri" w:cs="Calibri" w:eastAsia="Calibri" w:hAnsi="Calibri"/>
         </w:rPr>
-        <w:t xml:space="preserve">¿Qué estilo de fotografía convierte mejor (modelo vs. producto, cercano vs. aspiracional)?</w:t>
+        <w:t>Which photography style converts best (model vs. product, relatable vs. aspirational)?</w:t>
       </w:r>
     </w:p>
     <w:p>
@@ -3226,7 +3211,7 @@
           <w:szCs w:val="19"/>
           <w:rFonts w:ascii="Calibri" w:cs="Calibri" w:eastAsia="Calibri" w:hAnsi="Calibri"/>
         </w:rPr>
-        <w:t xml:space="preserve">¿Los colores de marca (dorado/teal) transmiten lo correcto para lencería/belleza?</w:t>
+        <w:t>Do the brand colours (gold/teal) convey the right message for lingerie/beauty?</w:t>
       </w:r>
     </w:p>
     <w:p>
@@ -3245,7 +3230,7 @@
           <w:szCs w:val="19"/>
           <w:rFonts w:ascii="Calibri" w:cs="Calibri" w:eastAsia="Calibri" w:hAnsi="Calibri"/>
         </w:rPr>
-        <w:t xml:space="preserve">¿Cómo se ve la marca frente a competidores locales e internacionales?</w:t>
+        <w:t>How does the brand look compared with local and international competitors?</w:t>
       </w:r>
     </w:p>
     <w:p>
@@ -3262,7 +3247,7 @@
           <w:szCs w:val="25"/>
           <w:rFonts w:ascii="Georgia" w:cs="Georgia" w:eastAsia="Georgia" w:hAnsi="Georgia"/>
         </w:rPr>
-        <w:t xml:space="preserve">4.3 Frontend / Producto digital</w:t>
+        <w:t>4.3 Frontend / Digital product</w:t>
       </w:r>
     </w:p>
     <w:p>
@@ -3278,7 +3263,7 @@
           <w:szCs w:val="20"/>
           <w:rFonts w:ascii="Calibri" w:cs="Calibri" w:eastAsia="Calibri" w:hAnsi="Calibri"/>
         </w:rPr>
-        <w:t xml:space="preserve">Q4 · </w:t>
+        <w:t>Q4 · FRONTEND</w:t>
       </w:r>
       <w:r>
         <w:rPr>
@@ -3289,7 +3274,6 @@
           <w:szCs w:val="16"/>
           <w:rFonts w:ascii="Calibri" w:cs="Calibri" w:eastAsia="Calibri" w:hAnsi="Calibri"/>
         </w:rPr>
-        <w:t xml:space="preserve">FRONTEND</w:t>
       </w:r>
     </w:p>
     <w:p>
@@ -3305,7 +3289,7 @@
           <w:szCs w:val="20"/>
           <w:rFonts w:ascii="Calibri" w:cs="Calibri" w:eastAsia="Calibri" w:hAnsi="Calibri"/>
         </w:rPr>
-        <w:t xml:space="preserve">Pregunta principal: </w:t>
+        <w:t>Main question: Does the mobile experience live up to a mobile-first market?</w:t>
       </w:r>
       <w:r>
         <w:rPr>
@@ -3314,7 +3298,6 @@
           <w:szCs w:val="20"/>
           <w:rFonts w:ascii="Calibri" w:cs="Calibri" w:eastAsia="Calibri" w:hAnsi="Calibri"/>
         </w:rPr>
-        <w:t xml:space="preserve">¿La experiencia móvil está a la altura de un mercado móvil-primero?</w:t>
       </w:r>
     </w:p>
     <w:p>
@@ -3333,7 +3316,7 @@
           <w:szCs w:val="19"/>
           <w:rFonts w:ascii="Calibri" w:cs="Calibri" w:eastAsia="Calibri" w:hAnsi="Calibri"/>
         </w:rPr>
-        <w:t xml:space="preserve">¿Cuánto tarda en cargar en 4G? ¿Qué imágenes pesan de más?</w:t>
+        <w:t>How long does it take to load on 4G? Which images are too heavy?</w:t>
       </w:r>
     </w:p>
     <w:p>
@@ -3352,7 +3335,7 @@
           <w:szCs w:val="19"/>
           <w:rFonts w:ascii="Calibri" w:cs="Calibri" w:eastAsia="Calibri" w:hAnsi="Calibri"/>
         </w:rPr>
-        <w:t xml:space="preserve">¿El checkout funciona sin errores en los teléfonos más comunes de la isla?</w:t>
+        <w:t>Does the checkout work without errors on the most common phones on the island?</w:t>
       </w:r>
     </w:p>
     <w:p>
@@ -3371,7 +3354,7 @@
           <w:szCs w:val="19"/>
           <w:rFonts w:ascii="Calibri" w:cs="Calibri" w:eastAsia="Calibri" w:hAnsi="Calibri"/>
         </w:rPr>
-        <w:t xml:space="preserve">¿Qué micro-interacciones reducen la fricción (autocompletar, guardar dirección)?</w:t>
+        <w:t>Which micro-interactions reduce friction (autocomplete, saved address)?</w:t>
       </w:r>
     </w:p>
     <w:p>
@@ -3388,7 +3371,7 @@
           <w:szCs w:val="25"/>
           <w:rFonts w:ascii="Georgia" w:cs="Georgia" w:eastAsia="Georgia" w:hAnsi="Georgia"/>
         </w:rPr>
-        <w:t xml:space="preserve">4.4 Backend / Operación</w:t>
+        <w:t>4.4 Backend / Operations</w:t>
       </w:r>
     </w:p>
     <w:p>
@@ -3404,7 +3387,7 @@
           <w:szCs w:val="20"/>
           <w:rFonts w:ascii="Calibri" w:cs="Calibri" w:eastAsia="Calibri" w:hAnsi="Calibri"/>
         </w:rPr>
-        <w:t xml:space="preserve">Q5 · </w:t>
+        <w:t>Q5 · BACKEND</w:t>
       </w:r>
       <w:r>
         <w:rPr>
@@ -3415,7 +3398,6 @@
           <w:szCs w:val="16"/>
           <w:rFonts w:ascii="Calibri" w:cs="Calibri" w:eastAsia="Calibri" w:hAnsi="Calibri"/>
         </w:rPr>
-        <w:t xml:space="preserve">BACKEND</w:t>
       </w:r>
     </w:p>
     <w:p>
@@ -3431,7 +3413,7 @@
           <w:szCs w:val="20"/>
           <w:rFonts w:ascii="Calibri" w:cs="Calibri" w:eastAsia="Calibri" w:hAnsi="Calibri"/>
         </w:rPr>
-        <w:t xml:space="preserve">Pregunta principal: </w:t>
+        <w:t>Main question: Does the system support the real business operation (orders, payments, delivery)?</w:t>
       </w:r>
       <w:r>
         <w:rPr>
@@ -3440,7 +3422,6 @@
           <w:szCs w:val="20"/>
           <w:rFonts w:ascii="Calibri" w:cs="Calibri" w:eastAsia="Calibri" w:hAnsi="Calibri"/>
         </w:rPr>
-        <w:t xml:space="preserve">¿El sistema soporta la operación real del negocio (pedidos, pagos, delivery)?</w:t>
       </w:r>
     </w:p>
     <w:p>
@@ -3459,7 +3440,7 @@
           <w:szCs w:val="19"/>
           <w:rFonts w:ascii="Calibri" w:cs="Calibri" w:eastAsia="Calibri" w:hAnsi="Calibri"/>
         </w:rPr>
-        <w:t xml:space="preserve">¿Qué método de pago hay que activar/priorizar primero (Sentoo, COD, transferencia)?</w:t>
+        <w:t>Which payment method should be activated/prioritised first (Sentoo, COD, transfer)?</w:t>
       </w:r>
     </w:p>
     <w:p>
@@ -3478,7 +3459,7 @@
           <w:szCs w:val="19"/>
           <w:rFonts w:ascii="Calibri" w:cs="Calibri" w:eastAsia="Calibri" w:hAnsi="Calibri"/>
         </w:rPr>
-        <w:t xml:space="preserve">¿Cómo debe fluir un pedido desde "pagado" hasta "entregado" operativamente?</w:t>
+        <w:t>How should an order flow operationally from "paid" to "delivered"?</w:t>
       </w:r>
     </w:p>
     <w:p>
@@ -3497,7 +3478,7 @@
           <w:szCs w:val="19"/>
           <w:rFonts w:ascii="Calibri" w:cs="Calibri" w:eastAsia="Calibri" w:hAnsi="Calibri"/>
         </w:rPr>
-        <w:t xml:space="preserve">¿Qué avisos automáticos (email/WhatsApp) espera la clienta en cada estado?</w:t>
+        <w:t>Which automatic notifications (email/WhatsApp) does the customer expect at each status?</w:t>
       </w:r>
     </w:p>
     <w:p>
@@ -3514,7 +3495,7 @@
           <w:szCs w:val="25"/>
           <w:rFonts w:ascii="Georgia" w:cs="Georgia" w:eastAsia="Georgia" w:hAnsi="Georgia"/>
         </w:rPr>
-        <w:t xml:space="preserve">4.5 Delivery / Logística</w:t>
+        <w:t>4.5 Delivery / Logistics</w:t>
       </w:r>
     </w:p>
     <w:p>
@@ -3530,7 +3511,7 @@
           <w:szCs w:val="20"/>
           <w:rFonts w:ascii="Calibri" w:cs="Calibri" w:eastAsia="Calibri" w:hAnsi="Calibri"/>
         </w:rPr>
-        <w:t xml:space="preserve">Q6 · </w:t>
+        <w:t>Q6 · DELIVERY</w:t>
       </w:r>
       <w:r>
         <w:rPr>
@@ -3541,7 +3522,6 @@
           <w:szCs w:val="16"/>
           <w:rFonts w:ascii="Calibri" w:cs="Calibri" w:eastAsia="Calibri" w:hAnsi="Calibri"/>
         </w:rPr>
-        <w:t xml:space="preserve">DELIVERY</w:t>
       </w:r>
     </w:p>
     <w:p>
@@ -3557,7 +3537,7 @@
           <w:szCs w:val="20"/>
           <w:rFonts w:ascii="Calibri" w:cs="Calibri" w:eastAsia="Calibri" w:hAnsi="Calibri"/>
         </w:rPr>
-        <w:t xml:space="preserve">Pregunta principal: </w:t>
+        <w:t>Main question: How do we turn delivery into a competitive advantage?</w:t>
       </w:r>
       <w:r>
         <w:rPr>
@@ -3566,7 +3546,6 @@
           <w:szCs w:val="20"/>
           <w:rFonts w:ascii="Calibri" w:cs="Calibri" w:eastAsia="Calibri" w:hAnsi="Calibri"/>
         </w:rPr>
-        <w:t xml:space="preserve">¿Cómo convertimos el delivery en una ventaja competitiva?</w:t>
       </w:r>
     </w:p>
     <w:p>
@@ -3585,7 +3564,7 @@
           <w:szCs w:val="19"/>
           <w:rFonts w:ascii="Calibri" w:cs="Calibri" w:eastAsia="Calibri" w:hAnsi="Calibri"/>
         </w:rPr>
-        <w:t xml:space="preserve">¿Qué tiempo de entrega espera por zona y cuánto pagaría de envío?</w:t>
+        <w:t>What delivery time does she expect per zone, and how much would she pay for shipping?</w:t>
       </w:r>
     </w:p>
     <w:p>
@@ -3604,7 +3583,7 @@
           <w:szCs w:val="19"/>
           <w:rFonts w:ascii="Calibri" w:cs="Calibri" w:eastAsia="Calibri" w:hAnsi="Calibri"/>
         </w:rPr>
-        <w:t xml:space="preserve">¿Quién entrega (repartidor propio, courier, retiro en tienda) y a qué costo?</w:t>
+        <w:t>Who delivers (own delivery person, courier, in-store pickup), and at what cost?</w:t>
       </w:r>
     </w:p>
     <w:p>
@@ -3623,7 +3602,7 @@
           <w:szCs w:val="19"/>
           <w:rFonts w:ascii="Calibri" w:cs="Calibri" w:eastAsia="Calibri" w:hAnsi="Calibri"/>
         </w:rPr>
-        <w:t xml:space="preserve">¿Necesita elegir franja horaria o basta con entrega estándar?</w:t>
+        <w:t>Does she need to choose a time slot, or is standard delivery enough?</w:t>
       </w:r>
     </w:p>
     <w:p>
@@ -3642,7 +3621,7 @@
           <w:szCs w:val="19"/>
           <w:rFonts w:ascii="Calibri" w:cs="Calibri" w:eastAsia="Calibri" w:hAnsi="Calibri"/>
         </w:rPr>
-        <w:t xml:space="preserve">¿Las 3 zonas y sus tarifas (5/10/25 XCG) reflejan bien costo y expectativa?</w:t>
+        <w:t>Do the 3 zones and their fees (5/10/25 XCG) accurately reflect cost and expectations?</w:t>
       </w:r>
     </w:p>
     <w:p>
@@ -3659,7 +3638,7 @@
           <w:szCs w:val="25"/>
           <w:rFonts w:ascii="Georgia" w:cs="Georgia" w:eastAsia="Georgia" w:hAnsi="Georgia"/>
         </w:rPr>
-        <w:t xml:space="preserve">4.6 Marketing / Crecimiento</w:t>
+        <w:t>4.6 Marketing / Growth</w:t>
       </w:r>
     </w:p>
     <w:p>
@@ -3675,7 +3654,7 @@
           <w:szCs w:val="20"/>
           <w:rFonts w:ascii="Calibri" w:cs="Calibri" w:eastAsia="Calibri" w:hAnsi="Calibri"/>
         </w:rPr>
-        <w:t xml:space="preserve">Q7 · </w:t>
+        <w:t>Q7 · MARKETING</w:t>
       </w:r>
       <w:r>
         <w:rPr>
@@ -3686,7 +3665,6 @@
           <w:szCs w:val="16"/>
           <w:rFonts w:ascii="Calibri" w:cs="Calibri" w:eastAsia="Calibri" w:hAnsi="Calibri"/>
         </w:rPr>
-        <w:t xml:space="preserve">MARKETING</w:t>
       </w:r>
     </w:p>
     <w:p>
@@ -3702,7 +3680,7 @@
           <w:szCs w:val="20"/>
           <w:rFonts w:ascii="Calibri" w:cs="Calibri" w:eastAsia="Calibri" w:hAnsi="Calibri"/>
         </w:rPr>
-        <w:t xml:space="preserve">Pregunta principal: </w:t>
+        <w:t>Main question: How do we attract and retain customers in a small, social market?</w:t>
       </w:r>
       <w:r>
         <w:rPr>
@@ -3711,7 +3689,6 @@
           <w:szCs w:val="20"/>
           <w:rFonts w:ascii="Calibri" w:cs="Calibri" w:eastAsia="Calibri" w:hAnsi="Calibri"/>
         </w:rPr>
-        <w:t xml:space="preserve">¿Cómo atraer y fidelizar en un mercado pequeño y social?</w:t>
       </w:r>
     </w:p>
     <w:p>
@@ -3730,7 +3707,7 @@
           <w:szCs w:val="19"/>
           <w:rFonts w:ascii="Calibri" w:cs="Calibri" w:eastAsia="Calibri" w:hAnsi="Calibri"/>
         </w:rPr>
-        <w:t xml:space="preserve">¿En qué red está tu clienta y qué contenido la mueve (TikTok video, IG estética, FB alcance)?</w:t>
+        <w:t>Which network is your customer on, and what content moves her (TikTok video, IG aesthetics, FB reach)?</w:t>
       </w:r>
     </w:p>
     <w:p>
@@ -3749,7 +3726,7 @@
           <w:szCs w:val="19"/>
           <w:rFonts w:ascii="Calibri" w:cs="Calibri" w:eastAsia="Calibri" w:hAnsi="Calibri"/>
         </w:rPr>
-        <w:t xml:space="preserve">¿Qué busca en Google para encontrar estos productos localmente (SEO)?</w:t>
+        <w:t>What does she search for on Google to find these products locally (SEO)?</w:t>
       </w:r>
     </w:p>
     <w:p>
@@ -3768,7 +3745,7 @@
           <w:szCs w:val="19"/>
           <w:rFonts w:ascii="Calibri" w:cs="Calibri" w:eastAsia="Calibri" w:hAnsi="Calibri"/>
         </w:rPr>
-        <w:t xml:space="preserve">¿Qué la haría volver (novedades, ofertas, programa de fidelidad)?</w:t>
+        <w:t>What would make her come back (new arrivals, offers, loyalty programme)?</w:t>
       </w:r>
     </w:p>
     <w:p>
@@ -3787,7 +3764,7 @@
           <w:szCs w:val="19"/>
           <w:rFonts w:ascii="Calibri" w:cs="Calibri" w:eastAsia="Calibri" w:hAnsi="Calibri"/>
         </w:rPr>
-        <w:t xml:space="preserve">¿Cómo usar WhatsApp para recuperar carritos y avisar de novedades sin ser invasivos?</w:t>
+        <w:t>How can WhatsApp be used to recover carts and announce new arrivals without being intrusive?</w:t>
       </w:r>
     </w:p>
     <w:p>
@@ -3804,7 +3781,7 @@
           <w:szCs w:val="25"/>
           <w:rFonts w:ascii="Georgia" w:cs="Georgia" w:eastAsia="Georgia" w:hAnsi="Georgia"/>
         </w:rPr>
-        <w:t xml:space="preserve">4.7 Contenido / Localización</w:t>
+        <w:t>4.7 Content / Localisation</w:t>
       </w:r>
     </w:p>
     <w:p>
@@ -3820,7 +3797,7 @@
           <w:szCs w:val="20"/>
           <w:rFonts w:ascii="Calibri" w:cs="Calibri" w:eastAsia="Calibri" w:hAnsi="Calibri"/>
         </w:rPr>
-        <w:t xml:space="preserve">Q8 · </w:t>
+        <w:t>Q8 · CONTENT</w:t>
       </w:r>
       <w:r>
         <w:rPr>
@@ -3831,7 +3808,6 @@
           <w:szCs w:val="16"/>
           <w:rFonts w:ascii="Calibri" w:cs="Calibri" w:eastAsia="Calibri" w:hAnsi="Calibri"/>
         </w:rPr>
-        <w:t xml:space="preserve">CONTENIDO</w:t>
       </w:r>
     </w:p>
     <w:p>
@@ -3847,7 +3823,7 @@
           <w:szCs w:val="20"/>
           <w:rFonts w:ascii="Calibri" w:cs="Calibri" w:eastAsia="Calibri" w:hAnsi="Calibri"/>
         </w:rPr>
-        <w:t xml:space="preserve">Pregunta principal: </w:t>
+        <w:t>Main question: In which language and tone should the store speak?</w:t>
       </w:r>
       <w:r>
         <w:rPr>
@@ -3856,7 +3832,6 @@
           <w:szCs w:val="20"/>
           <w:rFonts w:ascii="Calibri" w:cs="Calibri" w:eastAsia="Calibri" w:hAnsi="Calibri"/>
         </w:rPr>
-        <w:t xml:space="preserve">¿En qué idioma y tono debe hablar la tienda?</w:t>
       </w:r>
     </w:p>
     <w:p>
@@ -3875,7 +3850,7 @@
           <w:szCs w:val="19"/>
           <w:rFonts w:ascii="Calibri" w:cs="Calibri" w:eastAsia="Calibri" w:hAnsi="Calibri"/>
         </w:rPr>
-        <w:t xml:space="preserve">¿Papiamentu, español, inglés o neerlandés como idioma principal de interfaz?</w:t>
+        <w:t>Papiamentu, Spanish, English or Dutch as the main interface language?</w:t>
       </w:r>
     </w:p>
     <w:p>
@@ -3894,7 +3869,7 @@
           <w:szCs w:val="19"/>
           <w:rFonts w:ascii="Calibri" w:cs="Calibri" w:eastAsia="Calibri" w:hAnsi="Calibri"/>
         </w:rPr>
-        <w:t xml:space="preserve">¿Vale la pena multi-idioma o enfocar uno bien hecho?</w:t>
+        <w:t>Is multilingual support worthwhile, or should we focus on doing one language well?</w:t>
       </w:r>
     </w:p>
     <w:p>
@@ -3913,7 +3888,7 @@
           <w:szCs w:val="19"/>
           <w:rFonts w:ascii="Calibri" w:cs="Calibri" w:eastAsia="Calibri" w:hAnsi="Calibri"/>
         </w:rPr>
-        <w:t xml:space="preserve">¿Qué tono (cercano, aspiracional, discreto) genera confianza en productos íntimos?</w:t>
+        <w:t>Which tone (warm, aspirational, discreet) builds trust for intimate products?</w:t>
       </w:r>
     </w:p>
     <w:p>
@@ -3938,7 +3913,7 @@
           <w:szCs w:val="30"/>
           <w:rFonts w:ascii="Georgia" w:cs="Georgia" w:eastAsia="Georgia" w:hAnsi="Georgia"/>
         </w:rPr>
-        <w:t xml:space="preserve">5. "Cómo podríamos…" (How Might We)</w:t>
+        <w:t>5. "How Might We…" (HMW)</w:t>
       </w:r>
     </w:p>
     <w:p>
@@ -3957,7 +3932,7 @@
           <w:szCs w:val="21"/>
           <w:rFonts w:ascii="Calibri" w:cs="Calibri" w:eastAsia="Calibri" w:hAnsi="Calibri"/>
         </w:rPr>
-        <w:t xml:space="preserve">Frases para disparar ideas en el brainstorming. Cada una reencuadra un reto como una oportunidad abierta. Úsenlas para llenar una pizarra de ideas (una por post-it).</w:t>
+        <w:t>Prompts to spark ideas during brainstorming. Each one reframes a challenge as an open opportunity. Use them to fill an idea board (one per post-it).</w:t>
       </w:r>
     </w:p>
     <w:p>
@@ -3974,7 +3949,7 @@
           <w:szCs w:val="22"/>
           <w:rFonts w:ascii="Calibri" w:cs="Calibri" w:eastAsia="Calibri" w:hAnsi="Calibri"/>
         </w:rPr>
-        <w:t xml:space="preserve">Confianza</w:t>
+        <w:t>Trust</w:t>
       </w:r>
     </w:p>
     <w:p>
@@ -3991,7 +3966,7 @@
           <w:szCs w:val="20"/>
           <w:rFonts w:ascii="Calibri" w:cs="Calibri" w:eastAsia="Calibri" w:hAnsi="Calibri"/>
         </w:rPr>
-        <w:t xml:space="preserve">“¿Cómo podríamos… </w:t>
+        <w:t>“How might we… make a first-time customer feel 100% confident buying lingerie online?”</w:t>
       </w:r>
       <w:r>
         <w:rPr>
@@ -4000,7 +3975,6 @@
           <w:szCs w:val="20"/>
           <w:rFonts w:ascii="Calibri" w:cs="Calibri" w:eastAsia="Calibri" w:hAnsi="Calibri"/>
         </w:rPr>
-        <w:t xml:space="preserve">hacer que una clienta primeriza se sienta 100% segura de comprar lencería en línea</w:t>
       </w:r>
       <w:r>
         <w:rPr>
@@ -4011,7 +3985,6 @@
           <w:szCs w:val="20"/>
           <w:rFonts w:ascii="Calibri" w:cs="Calibri" w:eastAsia="Calibri" w:hAnsi="Calibri"/>
         </w:rPr>
-        <w:t xml:space="preserve">?”</w:t>
       </w:r>
     </w:p>
     <w:p>
@@ -4028,7 +4001,7 @@
           <w:szCs w:val="20"/>
           <w:rFonts w:ascii="Calibri" w:cs="Calibri" w:eastAsia="Calibri" w:hAnsi="Calibri"/>
         </w:rPr>
-        <w:t xml:space="preserve">“¿Cómo podríamos… </w:t>
+        <w:t>“How might we… show that Unistyles is a local, real and trustworthy business within the first 5 seconds?”</w:t>
       </w:r>
       <w:r>
         <w:rPr>
@@ -4037,7 +4010,6 @@
           <w:szCs w:val="20"/>
           <w:rFonts w:ascii="Calibri" w:cs="Calibri" w:eastAsia="Calibri" w:hAnsi="Calibri"/>
         </w:rPr>
-        <w:t xml:space="preserve">mostrar que Unistyles es un negocio local, real y confiable en los primeros 5 segundos</w:t>
       </w:r>
       <w:r>
         <w:rPr>
@@ -4048,7 +4020,6 @@
           <w:szCs w:val="20"/>
           <w:rFonts w:ascii="Calibri" w:cs="Calibri" w:eastAsia="Calibri" w:hAnsi="Calibri"/>
         </w:rPr>
-        <w:t xml:space="preserve">?”</w:t>
       </w:r>
     </w:p>
     <w:p>
@@ -4065,7 +4036,7 @@
           <w:szCs w:val="22"/>
           <w:rFonts w:ascii="Calibri" w:cs="Calibri" w:eastAsia="Calibri" w:hAnsi="Calibri"/>
         </w:rPr>
-        <w:t xml:space="preserve">Checkout y móvil</w:t>
+        <w:t>Checkout and mobile</w:t>
       </w:r>
     </w:p>
     <w:p>
@@ -4082,7 +4053,7 @@
           <w:szCs w:val="20"/>
           <w:rFonts w:ascii="Calibri" w:cs="Calibri" w:eastAsia="Calibri" w:hAnsi="Calibri"/>
         </w:rPr>
-        <w:t xml:space="preserve">“¿Cómo podríamos… </w:t>
+        <w:t>“How might we… reduce checkout on the phone to the bare minimum?”</w:t>
       </w:r>
       <w:r>
         <w:rPr>
@@ -4091,7 +4062,6 @@
           <w:szCs w:val="20"/>
           <w:rFonts w:ascii="Calibri" w:cs="Calibri" w:eastAsia="Calibri" w:hAnsi="Calibri"/>
         </w:rPr>
-        <w:t xml:space="preserve">reducir el checkout a lo mínimo indispensable en el teléfono</w:t>
       </w:r>
       <w:r>
         <w:rPr>
@@ -4102,7 +4072,6 @@
           <w:szCs w:val="20"/>
           <w:rFonts w:ascii="Calibri" w:cs="Calibri" w:eastAsia="Calibri" w:hAnsi="Calibri"/>
         </w:rPr>
-        <w:t xml:space="preserve">?”</w:t>
       </w:r>
     </w:p>
     <w:p>
@@ -4119,7 +4088,7 @@
           <w:szCs w:val="20"/>
           <w:rFonts w:ascii="Calibri" w:cs="Calibri" w:eastAsia="Calibri" w:hAnsi="Calibri"/>
         </w:rPr>
-        <w:t xml:space="preserve">“¿Cómo podríamos… </w:t>
+        <w:t>“How might we… remove size doubts before adding to cart?”</w:t>
       </w:r>
       <w:r>
         <w:rPr>
@@ -4128,7 +4097,6 @@
           <w:szCs w:val="20"/>
           <w:rFonts w:ascii="Calibri" w:cs="Calibri" w:eastAsia="Calibri" w:hAnsi="Calibri"/>
         </w:rPr>
-        <w:t xml:space="preserve">eliminar la duda de la talla antes de agregar al carrito</w:t>
       </w:r>
       <w:r>
         <w:rPr>
@@ -4139,7 +4107,6 @@
           <w:szCs w:val="20"/>
           <w:rFonts w:ascii="Calibri" w:cs="Calibri" w:eastAsia="Calibri" w:hAnsi="Calibri"/>
         </w:rPr>
-        <w:t xml:space="preserve">?”</w:t>
       </w:r>
     </w:p>
     <w:p>
@@ -4156,7 +4123,7 @@
           <w:szCs w:val="22"/>
           <w:rFonts w:ascii="Calibri" w:cs="Calibri" w:eastAsia="Calibri" w:hAnsi="Calibri"/>
         </w:rPr>
-        <w:t xml:space="preserve">Delivery</w:t>
+        <w:t>Delivery</w:t>
       </w:r>
     </w:p>
     <w:p>
@@ -4173,7 +4140,7 @@
           <w:szCs w:val="20"/>
           <w:rFonts w:ascii="Calibri" w:cs="Calibri" w:eastAsia="Calibri" w:hAnsi="Calibri"/>
         </w:rPr>
-        <w:t xml:space="preserve">“¿Cómo podríamos… </w:t>
+        <w:t>“How might we… let the customer know exactly when her order will arrive and how much it will cost?”</w:t>
       </w:r>
       <w:r>
         <w:rPr>
@@ -4182,7 +4149,6 @@
           <w:szCs w:val="20"/>
           <w:rFonts w:ascii="Calibri" w:cs="Calibri" w:eastAsia="Calibri" w:hAnsi="Calibri"/>
         </w:rPr>
-        <w:t xml:space="preserve">hacer que la clienta sepa exactamente cuándo y por cuánto llegará su pedido</w:t>
       </w:r>
       <w:r>
         <w:rPr>
@@ -4193,7 +4159,6 @@
           <w:szCs w:val="20"/>
           <w:rFonts w:ascii="Calibri" w:cs="Calibri" w:eastAsia="Calibri" w:hAnsi="Calibri"/>
         </w:rPr>
-        <w:t xml:space="preserve">?”</w:t>
       </w:r>
     </w:p>
     <w:p>
@@ -4210,7 +4175,7 @@
           <w:szCs w:val="20"/>
           <w:rFonts w:ascii="Calibri" w:cs="Calibri" w:eastAsia="Calibri" w:hAnsi="Calibri"/>
         </w:rPr>
-        <w:t xml:space="preserve">“¿Cómo podríamos… </w:t>
+        <w:t>“How might we… keep the customer informed about her delivery without her having to ask?”</w:t>
       </w:r>
       <w:r>
         <w:rPr>
@@ -4219,7 +4184,6 @@
           <w:szCs w:val="20"/>
           <w:rFonts w:ascii="Calibri" w:cs="Calibri" w:eastAsia="Calibri" w:hAnsi="Calibri"/>
         </w:rPr>
-        <w:t xml:space="preserve">mantener a la clienta informada de su entrega sin que tenga que preguntar</w:t>
       </w:r>
       <w:r>
         <w:rPr>
@@ -4230,7 +4194,6 @@
           <w:szCs w:val="20"/>
           <w:rFonts w:ascii="Calibri" w:cs="Calibri" w:eastAsia="Calibri" w:hAnsi="Calibri"/>
         </w:rPr>
-        <w:t xml:space="preserve">?”</w:t>
       </w:r>
     </w:p>
     <w:p>
@@ -4247,7 +4210,7 @@
           <w:szCs w:val="22"/>
           <w:rFonts w:ascii="Calibri" w:cs="Calibri" w:eastAsia="Calibri" w:hAnsi="Calibri"/>
         </w:rPr>
-        <w:t xml:space="preserve">Marketing y fidelidad</w:t>
+        <w:t>Marketing and loyalty</w:t>
       </w:r>
     </w:p>
     <w:p>
@@ -4264,7 +4227,7 @@
           <w:szCs w:val="20"/>
           <w:rFonts w:ascii="Calibri" w:cs="Calibri" w:eastAsia="Calibri" w:hAnsi="Calibri"/>
         </w:rPr>
-        <w:t xml:space="preserve">“¿Cómo podríamos… </w:t>
+        <w:t>“How might we… turn a happy customer into a promoter within her circle?”</w:t>
       </w:r>
       <w:r>
         <w:rPr>
@@ -4273,7 +4236,6 @@
           <w:szCs w:val="20"/>
           <w:rFonts w:ascii="Calibri" w:cs="Calibri" w:eastAsia="Calibri" w:hAnsi="Calibri"/>
         </w:rPr>
-        <w:t xml:space="preserve">convertir a una clienta feliz en promotora dentro de su círculo</w:t>
       </w:r>
       <w:r>
         <w:rPr>
@@ -4284,7 +4246,6 @@
           <w:szCs w:val="20"/>
           <w:rFonts w:ascii="Calibri" w:cs="Calibri" w:eastAsia="Calibri" w:hAnsi="Calibri"/>
         </w:rPr>
-        <w:t xml:space="preserve">?”</w:t>
       </w:r>
     </w:p>
     <w:p>
@@ -4301,7 +4262,7 @@
           <w:szCs w:val="20"/>
           <w:rFonts w:ascii="Calibri" w:cs="Calibri" w:eastAsia="Calibri" w:hAnsi="Calibri"/>
         </w:rPr>
-        <w:t xml:space="preserve">“¿Cómo podríamos… </w:t>
+        <w:t>“How might we… use WhatsApp to sell more without being a nuisance?”</w:t>
       </w:r>
       <w:r>
         <w:rPr>
@@ -4310,7 +4271,6 @@
           <w:szCs w:val="20"/>
           <w:rFonts w:ascii="Calibri" w:cs="Calibri" w:eastAsia="Calibri" w:hAnsi="Calibri"/>
         </w:rPr>
-        <w:t xml:space="preserve">usar WhatsApp para vender más sin molestar</w:t>
       </w:r>
       <w:r>
         <w:rPr>
@@ -4321,7 +4281,6 @@
           <w:szCs w:val="20"/>
           <w:rFonts w:ascii="Calibri" w:cs="Calibri" w:eastAsia="Calibri" w:hAnsi="Calibri"/>
         </w:rPr>
-        <w:t xml:space="preserve">?”</w:t>
       </w:r>
     </w:p>
     <w:p>
@@ -4338,7 +4297,7 @@
           <w:szCs w:val="22"/>
           <w:rFonts w:ascii="Calibri" w:cs="Calibri" w:eastAsia="Calibri" w:hAnsi="Calibri"/>
         </w:rPr>
-        <w:t xml:space="preserve">Idioma y cercanía</w:t>
+        <w:t>Language and closeness</w:t>
       </w:r>
     </w:p>
     <w:p>
@@ -4355,7 +4314,7 @@
           <w:szCs w:val="20"/>
           <w:rFonts w:ascii="Calibri" w:cs="Calibri" w:eastAsia="Calibri" w:hAnsi="Calibri"/>
         </w:rPr>
-        <w:t xml:space="preserve">“¿Cómo podríamos… </w:t>
+        <w:t>“How might we… make the customer feel that the store "speaks her language"?”</w:t>
       </w:r>
       <w:r>
         <w:rPr>
@@ -4364,7 +4323,6 @@
           <w:szCs w:val="20"/>
           <w:rFonts w:ascii="Calibri" w:cs="Calibri" w:eastAsia="Calibri" w:hAnsi="Calibri"/>
         </w:rPr>
-        <w:t xml:space="preserve">hacer que la clienta sienta que la tienda "habla su idioma"</w:t>
       </w:r>
       <w:r>
         <w:rPr>
@@ -4375,7 +4333,6 @@
           <w:szCs w:val="20"/>
           <w:rFonts w:ascii="Calibri" w:cs="Calibri" w:eastAsia="Calibri" w:hAnsi="Calibri"/>
         </w:rPr>
-        <w:t xml:space="preserve">?”</w:t>
       </w:r>
     </w:p>
     <w:p>
@@ -4400,7 +4357,7 @@
           <w:szCs w:val="30"/>
           <w:rFonts w:ascii="Georgia" w:cs="Georgia" w:eastAsia="Georgia" w:hAnsi="Georgia"/>
         </w:rPr>
-        <w:t xml:space="preserve">6. Supuestos e hipótesis a validar</w:t>
+        <w:t>6. Assumptions and hypotheses to validate</w:t>
       </w:r>
     </w:p>
     <w:p>
@@ -4419,7 +4376,7 @@
           <w:szCs w:val="21"/>
           <w:rFonts w:ascii="Calibri" w:cs="Calibri" w:eastAsia="Calibri" w:hAnsi="Calibri"/>
         </w:rPr>
-        <w:t xml:space="preserve">Antes de construir, hay que probar estos supuestos. Marca cada uno como "validado" o "refutado" con evidencia de la investigación.</w:t>
+        <w:t>Before building, these assumptions must be tested. Mark each one as "validated" or "refuted" with evidence from the research.</w:t>
       </w:r>
     </w:p>
     <w:tbl>
@@ -4468,7 +4425,7 @@
                 <w:szCs w:val="18"/>
                 <w:rFonts w:ascii="Calibri" w:cs="Calibri" w:eastAsia="Calibri" w:hAnsi="Calibri"/>
               </w:rPr>
-              <w:t xml:space="preserve">#</w:t>
+              <w:t>#</w:t>
             </w:r>
           </w:p>
         </w:tc>
@@ -4497,7 +4454,7 @@
                 <w:szCs w:val="18"/>
                 <w:rFonts w:ascii="Calibri" w:cs="Calibri" w:eastAsia="Calibri" w:hAnsi="Calibri"/>
               </w:rPr>
-              <w:t xml:space="preserve">Supuesto / hipótesis</w:t>
+              <w:t>Assumption / hypothesis</w:t>
             </w:r>
           </w:p>
         </w:tc>
@@ -4526,7 +4483,7 @@
                 <w:szCs w:val="18"/>
                 <w:rFonts w:ascii="Calibri" w:cs="Calibri" w:eastAsia="Calibri" w:hAnsi="Calibri"/>
               </w:rPr>
-              <w:t xml:space="preserve">Cómo validar</w:t>
+              <w:t>How to validate</w:t>
             </w:r>
           </w:p>
         </w:tc>
@@ -4557,7 +4514,7 @@
                 <w:szCs w:val="18"/>
                 <w:rFonts w:ascii="Calibri" w:cs="Calibri" w:eastAsia="Calibri" w:hAnsi="Calibri"/>
               </w:rPr>
-              <w:t xml:space="preserve">S1</w:t>
+              <w:t>S1</w:t>
             </w:r>
           </w:p>
         </w:tc>
@@ -4586,7 +4543,7 @@
                 <w:szCs w:val="18"/>
                 <w:rFonts w:ascii="Calibri" w:cs="Calibri" w:eastAsia="Calibri" w:hAnsi="Calibri"/>
               </w:rPr>
-              <w:t xml:space="preserve">La mayoría comprará desde el móvil.</w:t>
+              <w:t>Most customers will buy from their phone.</w:t>
             </w:r>
           </w:p>
         </w:tc>
@@ -4615,7 +4572,7 @@
                 <w:szCs w:val="18"/>
                 <w:rFonts w:ascii="Calibri" w:cs="Calibri" w:eastAsia="Calibri" w:hAnsi="Calibri"/>
               </w:rPr>
-              <w:t xml:space="preserve">Analítica de dispositivos tras lanzar (dato 2025 lo sugiere fuerte).</w:t>
+              <w:t>Device analytics after launch (2025 data strongly suggests this).</w:t>
             </w:r>
           </w:p>
         </w:tc>
@@ -4646,7 +4603,7 @@
                 <w:szCs w:val="18"/>
                 <w:rFonts w:ascii="Calibri" w:cs="Calibri" w:eastAsia="Calibri" w:hAnsi="Calibri"/>
               </w:rPr>
-              <w:t xml:space="preserve">S2</w:t>
+              <w:t>S2</w:t>
             </w:r>
           </w:p>
         </w:tc>
@@ -4675,7 +4632,7 @@
                 <w:szCs w:val="18"/>
                 <w:rFonts w:ascii="Calibri" w:cs="Calibri" w:eastAsia="Calibri" w:hAnsi="Calibri"/>
               </w:rPr>
-              <w:t xml:space="preserve">Sentoo es el método de pago de mayor confianza.</w:t>
+              <w:t>Sentoo is the most trusted payment method.</w:t>
             </w:r>
           </w:p>
         </w:tc>
@@ -4704,7 +4661,7 @@
                 <w:szCs w:val="18"/>
                 <w:rFonts w:ascii="Calibri" w:cs="Calibri" w:eastAsia="Calibri" w:hAnsi="Calibri"/>
               </w:rPr>
-              <w:t xml:space="preserve">Encuesta + prueba de método por defecto.</w:t>
+              <w:t>Survey + default-method test.</w:t>
             </w:r>
           </w:p>
         </w:tc>
@@ -4735,7 +4692,7 @@
                 <w:szCs w:val="18"/>
                 <w:rFonts w:ascii="Calibri" w:cs="Calibri" w:eastAsia="Calibri" w:hAnsi="Calibri"/>
               </w:rPr>
-              <w:t xml:space="preserve">S3</w:t>
+              <w:t>S3</w:t>
             </w:r>
           </w:p>
         </w:tc>
@@ -4764,7 +4721,7 @@
                 <w:szCs w:val="18"/>
                 <w:rFonts w:ascii="Calibri" w:cs="Calibri" w:eastAsia="Calibri" w:hAnsi="Calibri"/>
               </w:rPr>
-              <w:t xml:space="preserve">La talla es la barrera #1 en lencería.</w:t>
+              <w:t>Size is the #1 barrier in lingerie.</w:t>
             </w:r>
           </w:p>
         </w:tc>
@@ -4793,7 +4750,7 @@
                 <w:szCs w:val="18"/>
                 <w:rFonts w:ascii="Calibri" w:cs="Calibri" w:eastAsia="Calibri" w:hAnsi="Calibri"/>
               </w:rPr>
-              <w:t xml:space="preserve">Entrevistas + preguntas frecuentes en WhatsApp.</w:t>
+              <w:t>Interviews + frequently asked questions on WhatsApp.</w:t>
             </w:r>
           </w:p>
         </w:tc>
@@ -4824,7 +4781,7 @@
                 <w:szCs w:val="18"/>
                 <w:rFonts w:ascii="Calibri" w:cs="Calibri" w:eastAsia="Calibri" w:hAnsi="Calibri"/>
               </w:rPr>
-              <w:t xml:space="preserve">S4</w:t>
+              <w:t>S4</w:t>
             </w:r>
           </w:p>
         </w:tc>
@@ -4853,7 +4810,7 @@
                 <w:szCs w:val="18"/>
                 <w:rFonts w:ascii="Calibri" w:cs="Calibri" w:eastAsia="Calibri" w:hAnsi="Calibri"/>
               </w:rPr>
-              <w:t xml:space="preserve">La clienta prefiere papiamentu o español sobre inglés.</w:t>
+              <w:t>The customer prefers Papiamentu or Spanish over English.</w:t>
             </w:r>
           </w:p>
         </w:tc>
@@ -4882,7 +4839,7 @@
                 <w:szCs w:val="18"/>
                 <w:rFonts w:ascii="Calibri" w:cs="Calibri" w:eastAsia="Calibri" w:hAnsi="Calibri"/>
               </w:rPr>
-              <w:t xml:space="preserve">Encuesta de idioma.</w:t>
+              <w:t>Language survey.</w:t>
             </w:r>
           </w:p>
         </w:tc>
@@ -4913,7 +4870,7 @@
                 <w:szCs w:val="18"/>
                 <w:rFonts w:ascii="Calibri" w:cs="Calibri" w:eastAsia="Calibri" w:hAnsi="Calibri"/>
               </w:rPr>
-              <w:t xml:space="preserve">S5</w:t>
+              <w:t>S5</w:t>
             </w:r>
           </w:p>
         </w:tc>
@@ -4942,7 +4899,7 @@
                 <w:szCs w:val="18"/>
                 <w:rFonts w:ascii="Calibri" w:cs="Calibri" w:eastAsia="Calibri" w:hAnsi="Calibri"/>
               </w:rPr>
-              <w:t xml:space="preserve">El envío gratis sobre cierto monto sube el ticket promedio.</w:t>
+              <w:t>Free shipping above a certain amount increases the average order value.</w:t>
             </w:r>
           </w:p>
         </w:tc>
@@ -4971,7 +4928,7 @@
                 <w:szCs w:val="18"/>
                 <w:rFonts w:ascii="Calibri" w:cs="Calibri" w:eastAsia="Calibri" w:hAnsi="Calibri"/>
               </w:rPr>
-              <w:t xml:space="preserve">Prueba A/B de umbral.</w:t>
+              <w:t>A/B test of the threshold.</w:t>
             </w:r>
           </w:p>
         </w:tc>
@@ -5002,7 +4959,7 @@
                 <w:szCs w:val="18"/>
                 <w:rFonts w:ascii="Calibri" w:cs="Calibri" w:eastAsia="Calibri" w:hAnsi="Calibri"/>
               </w:rPr>
-              <w:t xml:space="preserve">S6</w:t>
+              <w:t>S6</w:t>
             </w:r>
           </w:p>
         </w:tc>
@@ -5031,7 +4988,7 @@
                 <w:szCs w:val="18"/>
                 <w:rFonts w:ascii="Calibri" w:cs="Calibri" w:eastAsia="Calibri" w:hAnsi="Calibri"/>
               </w:rPr>
-              <w:t xml:space="preserve">WhatsApp cierra más ventas que el checkout puro al inicio.</w:t>
+              <w:t>WhatsApp closes more sales than checkout alone at the start.</w:t>
             </w:r>
           </w:p>
         </w:tc>
@@ -5060,7 +5017,7 @@
                 <w:szCs w:val="18"/>
                 <w:rFonts w:ascii="Calibri" w:cs="Calibri" w:eastAsia="Calibri" w:hAnsi="Calibri"/>
               </w:rPr>
-              <w:t xml:space="preserve">Comparar canales de pedido tras lanzar.</w:t>
+              <w:t>Compare order channels after launch.</w:t>
             </w:r>
           </w:p>
         </w:tc>
@@ -5091,7 +5048,7 @@
                 <w:szCs w:val="18"/>
                 <w:rFonts w:ascii="Calibri" w:cs="Calibri" w:eastAsia="Calibri" w:hAnsi="Calibri"/>
               </w:rPr>
-              <w:t xml:space="preserve">S7</w:t>
+              <w:t>S7</w:t>
             </w:r>
           </w:p>
         </w:tc>
@@ -5120,7 +5077,7 @@
                 <w:szCs w:val="18"/>
                 <w:rFonts w:ascii="Calibri" w:cs="Calibri" w:eastAsia="Calibri" w:hAnsi="Calibri"/>
               </w:rPr>
-              <w:t xml:space="preserve">Las 3 zonas y tarifas actuales son adecuadas.</w:t>
+              <w:t>The current 3 zones and fees are appropriate.</w:t>
             </w:r>
           </w:p>
         </w:tc>
@@ -5149,7 +5106,7 @@
                 <w:szCs w:val="18"/>
                 <w:rFonts w:ascii="Calibri" w:cs="Calibri" w:eastAsia="Calibri" w:hAnsi="Calibri"/>
               </w:rPr>
-              <w:t xml:space="preserve">Validación local + costo real de reparto.</w:t>
+              <w:t>Local validation + actual delivery cost.</w:t>
             </w:r>
           </w:p>
         </w:tc>
@@ -5177,7 +5134,7 @@
           <w:szCs w:val="30"/>
           <w:rFonts w:ascii="Georgia" w:cs="Georgia" w:eastAsia="Georgia" w:hAnsi="Georgia"/>
         </w:rPr>
-        <w:t xml:space="preserve">7. Persona hipótesis (borrador a validar)</w:t>
+        <w:t>7. Hypothesis persona (draft to be validated)</w:t>
       </w:r>
     </w:p>
     <w:p>
@@ -5196,7 +5153,7 @@
           <w:szCs w:val="21"/>
           <w:rFonts w:ascii="Calibri" w:cs="Calibri" w:eastAsia="Calibri" w:hAnsi="Calibri"/>
         </w:rPr>
-        <w:t xml:space="preserve">Un punto de partida para la sesión — NO es un hecho, es una hipótesis que la investigación (Q1) debe confirmar o corregir.</w:t>
+        <w:t>A starting point for the session — it is NOT a fact, it is a hypothesis that the research (Q1) must confirm or correct.</w:t>
       </w:r>
     </w:p>
     <w:tbl>
@@ -5239,7 +5196,7 @@
                 <w:szCs w:val="21"/>
                 <w:rFonts w:ascii="Calibri" w:cs="Calibri" w:eastAsia="Calibri" w:hAnsi="Calibri"/>
               </w:rPr>
-              <w:t xml:space="preserve">“Yerlin”, 34 años — Willemstad (hipótesis)</w:t>
+              <w:t>“Yerlin”, 34 years old — Willemstad (hypothesis)</w:t>
             </w:r>
           </w:p>
           <w:p>
@@ -5253,7 +5210,7 @@
                 <w:szCs w:val="20"/>
                 <w:rFonts w:ascii="Calibri" w:cs="Calibri" w:eastAsia="Calibri" w:hAnsi="Calibri"/>
               </w:rPr>
-              <w:t xml:space="preserve">Trabaja, usa el teléfono para casi todo, sigue tiendas en Instagram y TikTok, y pide por WhatsApp cuando tiene dudas. Compra lencería y belleza para sí y para regalar. Le preocupa acertar la talla y que el pago en línea sea seguro. Valora envío rápido dentro de Willemstad y trato cercano en papiamentu/español.</w:t>
+              <w:t>She works, uses her phone for almost everything, follows stores on Instagram and TikTok, and orders via WhatsApp when she has questions. She buys lingerie and beauty products for herself and as gifts. She worries about getting the size right and about online payment being secure. She values fast delivery within Willemstad and a personal touch in Papiamentu/Spanish.</w:t>
             </w:r>
           </w:p>
           <w:p>
@@ -5267,7 +5224,7 @@
                 <w:szCs w:val="20"/>
                 <w:rFonts w:ascii="Calibri" w:cs="Calibri" w:eastAsia="Calibri" w:hAnsi="Calibri"/>
               </w:rPr>
-              <w:t xml:space="preserve">Necesidades: confianza, talla correcta, pago local seguro, entrega clara.</w:t>
+              <w:t>Needs: trust, the right size, secure local payment, clear delivery.</w:t>
             </w:r>
           </w:p>
           <w:p>
@@ -5281,7 +5238,7 @@
                 <w:szCs w:val="20"/>
                 <w:rFonts w:ascii="Calibri" w:cs="Calibri" w:eastAsia="Calibri" w:hAnsi="Calibri"/>
               </w:rPr>
-              <w:t xml:space="preserve">Frustraciones: fotos poco claras, envíos caros o lentos, webs en inglés difíciles en el móvil.</w:t>
+              <w:t>Frustrations: unclear photos, expensive or slow shipping, English-language websites that are hard to use on mobile.</w:t>
             </w:r>
           </w:p>
         </w:tc>
@@ -5311,7 +5268,7 @@
           <w:szCs w:val="21"/>
           <w:rFonts w:ascii="Calibri" w:cs="Calibri" w:eastAsia="Calibri" w:hAnsi="Calibri"/>
         </w:rPr>
-        <w:t xml:space="preserve">En la sesión: contrasten esta hipótesis con lo que sepan de clientas reales y ajústenla. Idealmente creen 2–3 personas basadas en entrevistas.</w:t>
+        <w:t>In the session: compare this hypothesis with what you know about real customers and adjust it. Ideally, create 2–3 personas based on interviews.</w:t>
       </w:r>
     </w:p>
     <w:p>
@@ -5336,7 +5293,7 @@
           <w:szCs w:val="30"/>
           <w:rFonts w:ascii="Georgia" w:cs="Georgia" w:eastAsia="Georgia" w:hAnsi="Georgia"/>
         </w:rPr>
-        <w:t xml:space="preserve">8. Agenda sugerida para la sesión de brainstorming</w:t>
+        <w:t>8. Suggested agenda for the brainstorming session</w:t>
       </w:r>
     </w:p>
     <w:p>
@@ -5355,7 +5312,7 @@
           <w:szCs w:val="21"/>
           <w:rFonts w:ascii="Calibri" w:cs="Calibri" w:eastAsia="Calibri" w:hAnsi="Calibri"/>
         </w:rPr>
-        <w:t xml:space="preserve">Sesión de ~2 horas con el equipo (UX/UI, front, back, marketing, diseño). Se conecta con el marco Double Diamond del Documento 5.</w:t>
+        <w:t>A ~2-hour session with the team (UX/UI, front end, back end, marketing, design). It connects to the Double Diamond framework in Document 5.</w:t>
       </w:r>
     </w:p>
     <w:tbl>
@@ -5404,7 +5361,7 @@
                 <w:szCs w:val="18"/>
                 <w:rFonts w:ascii="Calibri" w:cs="Calibri" w:eastAsia="Calibri" w:hAnsi="Calibri"/>
               </w:rPr>
-              <w:t xml:space="preserve">Tiempo</w:t>
+              <w:t>Time</w:t>
             </w:r>
           </w:p>
         </w:tc>
@@ -5433,7 +5390,7 @@
                 <w:szCs w:val="18"/>
                 <w:rFonts w:ascii="Calibri" w:cs="Calibri" w:eastAsia="Calibri" w:hAnsi="Calibri"/>
               </w:rPr>
-              <w:t xml:space="preserve">Actividad</w:t>
+              <w:t>Activity</w:t>
             </w:r>
           </w:p>
         </w:tc>
@@ -5462,7 +5419,7 @@
                 <w:szCs w:val="18"/>
                 <w:rFonts w:ascii="Calibri" w:cs="Calibri" w:eastAsia="Calibri" w:hAnsi="Calibri"/>
               </w:rPr>
-              <w:t xml:space="preserve">Resultado</w:t>
+              <w:t>Outcome</w:t>
             </w:r>
           </w:p>
         </w:tc>
@@ -5493,7 +5450,7 @@
                 <w:szCs w:val="18"/>
                 <w:rFonts w:ascii="Calibri" w:cs="Calibri" w:eastAsia="Calibri" w:hAnsi="Calibri"/>
               </w:rPr>
-              <w:t xml:space="preserve">0:00–0:10</w:t>
+              <w:t>0:00–0:10</w:t>
             </w:r>
           </w:p>
         </w:tc>
@@ -5522,7 +5479,7 @@
                 <w:szCs w:val="18"/>
                 <w:rFonts w:ascii="Calibri" w:cs="Calibri" w:eastAsia="Calibri" w:hAnsi="Calibri"/>
               </w:rPr>
-              <w:t xml:space="preserve">Leer el deep research (sección 2) y los 5 insights</w:t>
+              <w:t>Read the deep research (section 2) and the 5 insights</w:t>
             </w:r>
           </w:p>
         </w:tc>
@@ -5551,7 +5508,7 @@
                 <w:szCs w:val="18"/>
                 <w:rFonts w:ascii="Calibri" w:cs="Calibri" w:eastAsia="Calibri" w:hAnsi="Calibri"/>
               </w:rPr>
-              <w:t xml:space="preserve">Contexto compartido</w:t>
+              <w:t>Shared context</w:t>
             </w:r>
           </w:p>
         </w:tc>
@@ -5582,7 +5539,7 @@
                 <w:szCs w:val="18"/>
                 <w:rFonts w:ascii="Calibri" w:cs="Calibri" w:eastAsia="Calibri" w:hAnsi="Calibri"/>
               </w:rPr>
-              <w:t xml:space="preserve">0:10–0:25</w:t>
+              <w:t>0:10–0:25</w:t>
             </w:r>
           </w:p>
         </w:tc>
@@ -5611,7 +5568,7 @@
                 <w:szCs w:val="18"/>
                 <w:rFonts w:ascii="Calibri" w:cs="Calibri" w:eastAsia="Calibri" w:hAnsi="Calibri"/>
               </w:rPr>
-              <w:t xml:space="preserve">Elegir 2–3 retos estratégicos (sección 3)</w:t>
+              <w:t>Choose 2–3 strategic challenges (section 3)</w:t>
             </w:r>
           </w:p>
         </w:tc>
@@ -5640,7 +5597,7 @@
                 <w:szCs w:val="18"/>
                 <w:rFonts w:ascii="Calibri" w:cs="Calibri" w:eastAsia="Calibri" w:hAnsi="Calibri"/>
               </w:rPr>
-              <w:t xml:space="preserve">Foco de la sesión</w:t>
+              <w:t>Session focus</w:t>
             </w:r>
           </w:p>
         </w:tc>
@@ -5671,7 +5628,7 @@
                 <w:szCs w:val="18"/>
                 <w:rFonts w:ascii="Calibri" w:cs="Calibri" w:eastAsia="Calibri" w:hAnsi="Calibri"/>
               </w:rPr>
-              <w:t xml:space="preserve">0:25–0:45</w:t>
+              <w:t>0:25–0:45</w:t>
             </w:r>
           </w:p>
         </w:tc>
@@ -5700,7 +5657,7 @@
                 <w:szCs w:val="18"/>
                 <w:rFonts w:ascii="Calibri" w:cs="Calibri" w:eastAsia="Calibri" w:hAnsi="Calibri"/>
               </w:rPr>
-              <w:t xml:space="preserve">Revisar persona hipótesis y ajustarla</w:t>
+              <w:t>Review the hypothesis persona and adjust it</w:t>
             </w:r>
           </w:p>
         </w:tc>
@@ -5729,7 +5686,7 @@
                 <w:szCs w:val="18"/>
                 <w:rFonts w:ascii="Calibri" w:cs="Calibri" w:eastAsia="Calibri" w:hAnsi="Calibri"/>
               </w:rPr>
-              <w:t xml:space="preserve">Persona v1</w:t>
+              <w:t>Persona v1</w:t>
             </w:r>
           </w:p>
         </w:tc>
@@ -5760,7 +5717,7 @@
                 <w:szCs w:val="18"/>
                 <w:rFonts w:ascii="Calibri" w:cs="Calibri" w:eastAsia="Calibri" w:hAnsi="Calibri"/>
               </w:rPr>
-              <w:t xml:space="preserve">0:45–1:15</w:t>
+              <w:t>0:45–1:15</w:t>
             </w:r>
           </w:p>
         </w:tc>
@@ -5789,7 +5746,7 @@
                 <w:szCs w:val="18"/>
                 <w:rFonts w:ascii="Calibri" w:cs="Calibri" w:eastAsia="Calibri" w:hAnsi="Calibri"/>
               </w:rPr>
-              <w:t xml:space="preserve">Brainstorm con los HMW (sección 5) — ideas en post-its</w:t>
+              <w:t>Brainstorm with the HMWs (section 5) — ideas on post-its</w:t>
             </w:r>
           </w:p>
         </w:tc>
@@ -5818,7 +5775,7 @@
                 <w:szCs w:val="18"/>
                 <w:rFonts w:ascii="Calibri" w:cs="Calibri" w:eastAsia="Calibri" w:hAnsi="Calibri"/>
               </w:rPr>
-              <w:t xml:space="preserve">Muro de ideas</w:t>
+              <w:t>Idea wall</w:t>
             </w:r>
           </w:p>
         </w:tc>
@@ -5849,7 +5806,7 @@
                 <w:szCs w:val="18"/>
                 <w:rFonts w:ascii="Calibri" w:cs="Calibri" w:eastAsia="Calibri" w:hAnsi="Calibri"/>
               </w:rPr>
-              <w:t xml:space="preserve">1:15–1:35</w:t>
+              <w:t>1:15–1:35</w:t>
             </w:r>
           </w:p>
         </w:tc>
@@ -5878,7 +5835,7 @@
                 <w:szCs w:val="18"/>
                 <w:rFonts w:ascii="Calibri" w:cs="Calibri" w:eastAsia="Calibri" w:hAnsi="Calibri"/>
               </w:rPr>
-              <w:t xml:space="preserve">Agrupar y votar ideas (dot voting)</w:t>
+              <w:t>Cluster and vote on ideas (dot voting)</w:t>
             </w:r>
           </w:p>
         </w:tc>
@@ -5907,7 +5864,7 @@
                 <w:szCs w:val="18"/>
                 <w:rFonts w:ascii="Calibri" w:cs="Calibri" w:eastAsia="Calibri" w:hAnsi="Calibri"/>
               </w:rPr>
-              <w:t xml:space="preserve">Top ideas</w:t>
+              <w:t>Top ideas</w:t>
             </w:r>
           </w:p>
         </w:tc>
@@ -5938,7 +5895,7 @@
                 <w:szCs w:val="18"/>
                 <w:rFonts w:ascii="Calibri" w:cs="Calibri" w:eastAsia="Calibri" w:hAnsi="Calibri"/>
               </w:rPr>
-              <w:t xml:space="preserve">1:35–1:55</w:t>
+              <w:t>1:35–1:55</w:t>
             </w:r>
           </w:p>
         </w:tc>
@@ -5967,7 +5924,7 @@
                 <w:szCs w:val="18"/>
                 <w:rFonts w:ascii="Calibri" w:cs="Calibri" w:eastAsia="Calibri" w:hAnsi="Calibri"/>
               </w:rPr>
-              <w:t xml:space="preserve">Repartir preguntas de investigación (sección 4) por rol</w:t>
+              <w:t>Assign research questions (section 4) by role</w:t>
             </w:r>
           </w:p>
         </w:tc>
@@ -5996,7 +5953,7 @@
                 <w:szCs w:val="18"/>
                 <w:rFonts w:ascii="Calibri" w:cs="Calibri" w:eastAsia="Calibri" w:hAnsi="Calibri"/>
               </w:rPr>
-              <w:t xml:space="preserve">Plan de research</w:t>
+              <w:t>Research plan</w:t>
             </w:r>
           </w:p>
         </w:tc>
@@ -6027,7 +5984,7 @@
                 <w:szCs w:val="18"/>
                 <w:rFonts w:ascii="Calibri" w:cs="Calibri" w:eastAsia="Calibri" w:hAnsi="Calibri"/>
               </w:rPr>
-              <w:t xml:space="preserve">1:55–2:00</w:t>
+              <w:t>1:55–2:00</w:t>
             </w:r>
           </w:p>
         </w:tc>
@@ -6056,7 +6013,7 @@
                 <w:szCs w:val="18"/>
                 <w:rFonts w:ascii="Calibri" w:cs="Calibri" w:eastAsia="Calibri" w:hAnsi="Calibri"/>
               </w:rPr>
-              <w:t xml:space="preserve">Definir próximos pasos y responsables</w:t>
+              <w:t>Define next steps and owners</w:t>
             </w:r>
           </w:p>
         </w:tc>
@@ -6085,7 +6042,7 @@
                 <w:szCs w:val="18"/>
                 <w:rFonts w:ascii="Calibri" w:cs="Calibri" w:eastAsia="Calibri" w:hAnsi="Calibri"/>
               </w:rPr>
-              <w:t xml:space="preserve">Acciones (Doc 5)</w:t>
+              <w:t>Actions (Doc 5)</w:t>
             </w:r>
           </w:p>
         </w:tc>
@@ -6113,7 +6070,7 @@
           <w:szCs w:val="30"/>
           <w:rFonts w:ascii="Georgia" w:cs="Georgia" w:eastAsia="Georgia" w:hAnsi="Georgia"/>
         </w:rPr>
-        <w:t xml:space="preserve">Fuentes</w:t>
+        <w:t>Sources</w:t>
       </w:r>
     </w:p>
     <w:p>
@@ -6132,7 +6089,7 @@
           <w:szCs w:val="21"/>
           <w:rFonts w:ascii="Calibri" w:cs="Calibri" w:eastAsia="Calibri" w:hAnsi="Calibri"/>
         </w:rPr>
-        <w:t xml:space="preserve">Datos de mercado 2025 usados en la sección 2:</w:t>
+        <w:t>2025 market data used in section 2:</w:t>
       </w:r>
     </w:p>
     <w:p>
@@ -6155,7 +6112,7 @@
           <w:szCs w:val="21"/>
           <w:rFonts w:ascii="Calibri" w:cs="Calibri" w:eastAsia="Calibri" w:hAnsi="Calibri"/>
         </w:rPr>
-        <w:t xml:space="preserve">DataReportal — Digital 2025: Curaçao (usuarios de internet 68,1%, redes sociales, plataformas).</w:t>
+        <w:t>DataReportal — Digital 2025: Curaçao (internet users 68.1%, social media, platforms).</w:t>
       </w:r>
     </w:p>
     <w:p>
@@ -6178,7 +6135,7 @@
           <w:szCs w:val="21"/>
           <w:rFonts w:ascii="Calibri" w:cs="Calibri" w:eastAsia="Calibri" w:hAnsi="Calibri"/>
         </w:rPr>
-        <w:t xml:space="preserve">DataReportal / population data — población ~185.000 y conexiones móviles 192.000 (104%).</w:t>
+        <w:t>DataReportal / population data — population ~185,000 and mobile connections 192,000 (104%).</w:t>
       </w:r>
     </w:p>
     <w:p>
@@ -6201,7 +6158,7 @@
           <w:szCs w:val="21"/>
           <w:rFonts w:ascii="Calibri" w:cs="Calibri" w:eastAsia="Calibri" w:hAnsi="Calibri"/>
         </w:rPr>
-        <w:t xml:space="preserve">Sentoo — “What is Sentoo” y anuncio de integración con MCB Group (método de pago local, bancos soportados).</w:t>
+        <w:t>Sentoo — “What is Sentoo” and the announcement of the integration with MCB Group (local payment method, supported banks).</w:t>
       </w:r>
     </w:p>
     <w:p>
@@ -6224,7 +6181,7 @@
           <w:szCs w:val="21"/>
           <w:rFonts w:ascii="Calibri" w:cs="Calibri" w:eastAsia="Calibri" w:hAnsi="Calibri"/>
         </w:rPr>
-        <w:t xml:space="preserve">Wikipedia — Papiamento (lengua materna de ~81% de la población).</w:t>
+        <w:t>Wikipedia — Papiamento (mother tongue of ~81% of the population).</w:t>
       </w:r>
     </w:p>
     <w:p>
@@ -6273,7 +6230,7 @@
                 <w:szCs w:val="20"/>
                 <w:rFonts w:ascii="Calibri" w:cs="Calibri" w:eastAsia="Calibri" w:hAnsi="Calibri"/>
               </w:rPr>
-              <w:t xml:space="preserve">Nota: las cifras son de reportes públicos de 2025 y sirven como orientación estratégica. Antes de decisiones grandes, confírmalas con investigación propia (Documento 3) y datos de tus propias ventas.</w:t>
+              <w:t>Note: the figures come from public 2025 reports and serve as strategic guidance. Before making major decisions, confirm them with your own research (Document 3) and data from your own sales.</w:t>
             </w:r>
           </w:p>
         </w:tc>
@@ -6281,6 +6238,7 @@
     </w:tbl>
     <w:sectPr>
       <w:footerReference w:type="default" r:id="rId6"/>
+      <w:headerReference w:type="default" r:id="rId7"/>
       <w:pgSz w:w="11906" w:h="16838" w:orient="portrait"/>
       <w:pgMar w:top="1100" w:right="1440" w:bottom="1100" w:left="1440" w:header="708" w:footer="708" w:gutter="0"/>
       <w:pgNumType/>
@@ -6310,7 +6268,7 @@
         <w:szCs w:val="16"/>
         <w:rFonts w:ascii="Calibri" w:cs="Calibri" w:eastAsia="Calibri" w:hAnsi="Calibri"/>
       </w:rPr>
-      <w:t xml:space="preserve">Unistyles Curaçao  ·  </w:t>
+      <w:t xml:space="preserve">Unistyles Curaçao  ·  Deep Research &amp; Brainstorming   ·   Page  / </w:t>
     </w:r>
     <w:r>
       <w:rPr>
@@ -6321,7 +6279,6 @@
         <w:szCs w:val="16"/>
         <w:rFonts w:ascii="Calibri" w:cs="Calibri" w:eastAsia="Calibri" w:hAnsi="Calibri"/>
       </w:rPr>
-      <w:t xml:space="preserve">Deep Research &amp; Brainstorming</w:t>
     </w:r>
     <w:r>
       <w:rPr>
@@ -6330,7 +6287,6 @@
         <w:szCs w:val="16"/>
         <w:rFonts w:ascii="Calibri" w:cs="Calibri" w:eastAsia="Calibri" w:hAnsi="Calibri"/>
       </w:rPr>
-      <w:t xml:space="preserve">   ·   </w:t>
     </w:r>
     <w:r>
       <w:rPr>
@@ -6339,16 +6295,6 @@
         <w:szCs w:val="16"/>
         <w:rFonts w:ascii="Calibri" w:cs="Calibri" w:eastAsia="Calibri" w:hAnsi="Calibri"/>
       </w:rPr>
-      <w:t xml:space="preserve">Pág. </w:t>
-      <w:fldChar w:fldCharType="begin"/>
-      <w:instrText xml:space="preserve">PAGE</w:instrText>
-      <w:fldChar w:fldCharType="separate"/>
-      <w:fldChar w:fldCharType="end"/>
-      <w:t xml:space="preserve"> / </w:t>
-      <w:fldChar w:fldCharType="begin"/>
-      <w:instrText xml:space="preserve">NUMPAGES</w:instrText>
-      <w:fldChar w:fldCharType="separate"/>
-      <w:fldChar w:fldCharType="end"/>
     </w:r>
   </w:p>
 </w:ftr>
@@ -6389,6 +6335,16 @@
     </w:p>
   </w:footnote>
 </w:footnotes>
+</file>
+
+<file path=word/header1.xml><?xml version="1.0" encoding="utf-8"?>
+<w:hdr xmlns:m="http://schemas.openxmlformats.org/officeDocument/2006/math" xmlns:mc="http://schemas.openxmlformats.org/markup-compatibility/2006" xmlns:mo="http://schemas.microsoft.com/office/mac/office/2008/main" xmlns:mv="urn:schemas-microsoft-com:mac:vml" xmlns:o="urn:schemas-microsoft-com:office:office" xmlns:r="http://schemas.openxmlformats.org/officeDocument/2006/relationships" xmlns:v="urn:schemas-microsoft-com:vml" xmlns:w10="urn:schemas-microsoft-com:office:word" xmlns:w14="http://schemas.microsoft.com/office/word/2010/wordml" xmlns:w="http://schemas.openxmlformats.org/wordprocessingml/2006/main" xmlns:wne="http://schemas.microsoft.com/office/word/2006/wordml" xmlns:wp14="http://schemas.microsoft.com/office/word/2010/wordprocessingDrawing" xmlns:wp="http://schemas.openxmlformats.org/drawingml/2006/wordprocessingDrawing" xmlns:wpc="http://schemas.microsoft.com/office/word/2010/wordprocessingCanvas" xmlns:wpg="http://schemas.microsoft.com/office/word/2010/wordprocessingGroup" xmlns:wpi="http://schemas.microsoft.com/office/word/2010/wordprocessingInk" xmlns:wps="http://schemas.microsoft.com/office/word/2010/wordprocessingShape" mc:Ignorable="w14 wp14">
+  <w:p>
+    <w:pPr>
+      <w:pStyle w:val="Header"/>
+    </w:pPr>
+  </w:p>
+</w:hdr>
 </file>
 
 <file path=word/numbering.xml><?xml version="1.0" encoding="utf-8"?>

</xml_diff>